<commit_message>
Rewrite v2 Chapter 2 from independent review
- Add a revelation: in four days the mine marks the boys "Absconded",
  slots return to the pool, Camilla's ration card stops (matches Ch22)
- Give the room conflict: Flitzberg refuses to let them leave tonight
  or send word to Gretchen, and holds his ground with Camilla
- Make "tomorrow" Camilla's call, not Flitzberg stalling
- Cut most Book 1 callbacks; gloss the four that stay (Gerald, the
  grandfather's face, the four doors, the mine gates)
- Cut the "the way X does Y" simile tic to one use
- Younger dialogue for Ben; Flitzberg physically hoarse after the grip
- Replace the duplicate epigraph with Book 1 Ch22, "If I tell you to
  stop, you stop..." (verbatim, unique in v2)
- Make the count exact: four of them, three awake
- Add claude-notes/ch02-independent-review-fixes.md change log

3,531 -> 2,140 words. manuscript/ untouched.

Co-Authored-By: Claude Opus 5.5 <noreply@anthropic.com>
</commit_message>
<xml_diff>
--- a/claude-notes/manuscript-v2/02-now-the-throat-merged.docx
+++ b/claude-notes/manuscript-v2/02-now-the-throat-merged.docx
@@ -22,7 +22,7 @@
           <w:i/>
           <w:color w:val="5C6B7D"/>
         </w:rPr>
-        <w:t>"The question is not what I did to you. The question is: what will you do to regain the freedom that was once your birthright?"</w:t>
+        <w:t>“If I tell you to stop, you stop. Even if every part of you is screaming to charge. You stop.”</w:t>
       </w:r>
     </w:p>
     <w:p>
@@ -32,7 +32,7 @@
           <w:i/>
           <w:color w:val="5C6B7D"/>
         </w:rPr>
-        <w:t>— Book 1, Chapter 25: Don't Do It</w:t>
+        <w:t>— Book 1, Chapter 22: The Engine and Eyes</w:t>
       </w:r>
     </w:p>
     <w:p>
@@ -50,7 +50,7 @@
           <w:b w:val="0"/>
           <w:i w:val="0"/>
         </w:rPr>
-        <w:t>Cold first. A cold with edges, pressed flat against her shoulder blade and the back of her skull: metal floor. Then a second cold, smaller and wetter, sitting on the place where her left arm stopped. Fresh sealant. It hadn't set all the way; it still had the chill of the can in it. Somebody had sprayed it within the last minute, and the hands that had done it had been shaking, because the seal was thick at the front and thin at the back, the way you coat a thing when you're trying not to look at it.</w:t>
+        <w:t>Cold first. Metal floor, flat against her shoulder blade and the back of her skull. Then a second cold, smaller and wetter, on the place where her left arm stopped. Fresh sealant. It hadn't set yet; it still had the chill of the can in it. Thick at the front, thin at the back. Whoever had sprayed it had been shaking, and hadn't wanted to look.</w:t>
       </w:r>
     </w:p>
     <w:p>
@@ -59,7 +59,7 @@
           <w:b w:val="0"/>
           <w:i w:val="0"/>
         </w:rPr>
-        <w:t>Ben's hands, then. Gage didn't shake when he worked. Gage pressed too hard.</w:t>
+        <w:t>Ben, then. Gage didn't shake when he worked. Gage pressed too hard.</w:t>
       </w:r>
     </w:p>
     <w:p>
@@ -68,7 +68,7 @@
           <w:b w:val="0"/>
           <w:i w:val="0"/>
         </w:rPr>
-        <w:t>Her left hand closed. She felt the fingers curl, the thumb come across the knuckles, the small pull in the forearm that went with it. All of it arrived on schedule, and none of it was there. She had explained this to Gerald at his broken table, with the mash between them, like a manual: the map stays drawn after the country is gone. It read differently from the inside. She let the hand that didn't exist stay closed. She'd deal with it when she had the room for it.</w:t>
+        <w:t>Her left hand closed. She felt the fingers curl, the thumb come across the knuckles, the small pull in the forearm. None of it was there. She'd explained this once to Gerald, back home, about the leg he didn't have anymore: the map stays drawn after the country's gone. She hadn't known what it felt like from the inside. She let the hand that didn't exist stay closed. She'd deal with it later.</w:t>
       </w:r>
     </w:p>
     <w:p>
@@ -86,7 +86,7 @@
           <w:b w:val="0"/>
           <w:i w:val="0"/>
         </w:rPr>
-        <w:t>"Why?" Her brother's voice, cracked down the middle. "Otto is here and still gone. Camilla is half-dead. What did we ever do to you?"</w:t>
+        <w:t>"Why?" Her brother, cracked down the middle. "Otto is here and still gone. Camilla is half-dead. What did we ever do to you?"</w:t>
       </w:r>
     </w:p>
     <w:p>
@@ -102,7 +102,7 @@
           <w:b w:val="0"/>
           <w:i w:val="0"/>
         </w:rPr>
-        <w:t xml:space="preserve"> So that was what she looked like from up there.</w:t>
+        <w:t xml:space="preserve"> So that was how she looked from up there.</w:t>
       </w:r>
     </w:p>
     <w:p>
@@ -111,7 +111,7 @@
           <w:b w:val="0"/>
           <w:i w:val="0"/>
         </w:rPr>
-        <w:t>"The question is not what I did to you." Smooth, made, even, the voice from the dolls and the cookies. "The question is: what will you do to regain the freedom that was once your birthright?"</w:t>
+        <w:t>"The question is not what I did to you." Smooth, made, even. "The question is: what will you do to regain the freedom that was once your birthright?"</w:t>
       </w:r>
     </w:p>
     <w:p>
@@ -121,15 +121,6 @@
           <w:i w:val="0"/>
         </w:rPr>
         <w:t>"What does that mean?" Ben, from somewhere low and close.</w:t>
-      </w:r>
-    </w:p>
-    <w:p>
-      <w:r>
-        <w:rPr>
-          <w:b w:val="0"/>
-          <w:i w:val="0"/>
-        </w:rPr>
-        <w:t>A pause, while someone in the room looked at each of them in turn.</w:t>
       </w:r>
     </w:p>
     <w:p>
@@ -156,15 +147,6 @@
           <w:b w:val="0"/>
           <w:i w:val="0"/>
         </w:rPr>
-        <w:t>The sound came from her left and above: a throat working against a grip, air going through a gap too small for it, wet and even. She knew the grip by the quality of the silence around it. Gage made no noise when he used his hands.</w:t>
-      </w:r>
-    </w:p>
-    <w:p>
-      <w:r>
-        <w:rPr>
-          <w:b w:val="0"/>
-          <w:i w:val="0"/>
-        </w:rPr>
         <w:t>She opened her eyes.</w:t>
       </w:r>
     </w:p>
@@ -174,7 +156,7 @@
           <w:b w:val="0"/>
           <w:i w:val="0"/>
         </w:rPr>
-        <w:t>Light, white and everywhere, the kind that didn't flicker because nothing was burning to make it. Grey ceiling. She turned her head on the floor and the room came in the way a machine comes in when you open the housing, piece by piece, each part set against the others until the whole thing was showing its work.</w:t>
+        <w:t>White light, everywhere, the kind that didn't flicker because nothing was burning to make it. She turned her head on the floor and took the room in a piece at a time.</w:t>
       </w:r>
     </w:p>
     <w:p>
@@ -183,7 +165,7 @@
           <w:b w:val="0"/>
           <w:i w:val="0"/>
         </w:rPr>
-        <w:t>Gage. Back to her, feet planted, the whole of his two hundred and twenty pounds set behind one arm. The arm ended in a hand, and the hand was around a man's throat, and the man was Flitzberg.</w:t>
+        <w:t>Gage, back to her, feet planted, all two hundred and twenty pounds of him set behind one arm, and at the end of the arm a hand, and in the hand Mr. Flitzberg's throat.</w:t>
       </w:r>
     </w:p>
     <w:p>
@@ -192,7 +174,7 @@
           <w:b w:val="0"/>
           <w:i w:val="0"/>
         </w:rPr>
-        <w:t>Flitzberg, who had not moved. Hands at his sides. Weight even on both feet. His face had gone the color a face goes, but his eyes were doing what they always did, which was measuring. He wasn't reaching for Gage's wrist. He wasn't reaching for anything.</w:t>
+        <w:t>Flitzberg hadn't moved. Hands at his sides. His face was going a bad color, but his eyes were still doing what they always did, which was measure. He wasn't reaching for Gage's wrist.</w:t>
       </w:r>
     </w:p>
     <w:p>
@@ -201,7 +183,7 @@
           <w:b w:val="0"/>
           <w:i w:val="0"/>
         </w:rPr>
-        <w:t>Ben, on his knees two body-lengths off, the spray can still in his hand, held the way you hold a tool when the job has moved on without you.</w:t>
+        <w:t>Ben, on his knees two body-lengths away, the spray can still in his fist.</w:t>
       </w:r>
     </w:p>
     <w:p>
@@ -210,7 +192,7 @@
           <w:b w:val="0"/>
           <w:i w:val="0"/>
         </w:rPr>
-        <w:t>Otto.</w:t>
+        <w:t>Otto. Standing, square to the room, arms at his sides. Chest rising, chest falling. Eyes open, and nothing behind them. He was looking at the far wall, and only at the wall.</w:t>
       </w:r>
     </w:p>
     <w:p>
@@ -219,7 +201,7 @@
           <w:b w:val="0"/>
           <w:i w:val="0"/>
         </w:rPr>
-        <w:t>Otto was standing. Square to the room, feet planted, arms at his sides. His chest rose. His chest fell. His eyes were open and had a shine on them, the shine of a gauge with nothing behind the glass. He was looking at the far wall, and the far wall was all he was looking at.</w:t>
+        <w:t>Behind him, the crystal. Three quarters green. The last quarter pulsing a slow, cold blue.</w:t>
       </w:r>
     </w:p>
     <w:p>
@@ -228,7 +210,7 @@
           <w:b w:val="0"/>
           <w:i w:val="0"/>
         </w:rPr>
-        <w:t>Behind him the crystal, which had been in every room because there had only ever been one room. Three quarters green. The last quarter pulsing blue, slow, like something still deciding.</w:t>
+        <w:t>She counted, because counting was what she did when nothing else would hold still. Gage. Ben. Otto. Her. Four of them. And Flitzberg.</w:t>
       </w:r>
     </w:p>
     <w:p>
@@ -237,7 +219,7 @@
           <w:b w:val="0"/>
           <w:i w:val="0"/>
         </w:rPr>
-        <w:t>She counted. Four of them, if she counted herself, and she did. One Flitzberg. One door, with glass in it, and shapes behind the glass that weren't moving. No controls. No hourglass. No voice. The room had finished with them.</w:t>
+        <w:t>She checked his jaw. The first time they'd met, he'd been wearing her dead grandfather's face, and a seam of light at the hinge had given him away. No seam now. Pale, smooth, full-cheeked, darkening under Gage's hand. His own face, she thought. Probably.</w:t>
       </w:r>
     </w:p>
     <w:p>
@@ -246,16 +228,7 @@
           <w:b w:val="0"/>
           <w:i w:val="0"/>
         </w:rPr>
-        <w:t>Then she looked at Flitzberg's jaw, because that was where it had shown both times before: a shimmer at the hinge, skin not quite agreeing with bone. Nothing moved there that shouldn't have. Smooth, pale, the full cheeks going dark now under Gage's hand. His own face, then, or the one he had decided to call his own. He'd spent a dead grandfather on her, and Gerald's face, limp and all, on the four of them. He wasn't going to waste a good trick on people who'd already seen it.</w:t>
-      </w:r>
-    </w:p>
-    <w:p>
-      <w:r>
-        <w:rPr>
-          <w:b w:val="0"/>
-          <w:i w:val="0"/>
-        </w:rPr>
-        <w:t>No guards in the room. Nobody behind the glass moving to help him. The man who had sealed corridors with electricity and dropped her into a tank of eels had walked in here alone, on purpose, and let the strongest boy in Sector One put a hand on his windpipe. A man who did that had either lost his mind or wanted to be within reach.</w:t>
+        <w:t>There were no guards in the room. Nobody behind the glass was moving. The man who ran this place had walked in alone and let the strongest boy in Sector One get a hand on his windpipe. Either he'd lost his mind, or he wanted to be within reach.</w:t>
       </w:r>
     </w:p>
     <w:p>
@@ -273,7 +246,7 @@
           <w:b w:val="0"/>
           <w:i w:val="0"/>
         </w:rPr>
-        <w:t>The grip was trembling. It hadn't tightened in the time she'd been watching, and the long muscles of her brother's forearm were jumping under the skin.</w:t>
+        <w:t>Gage's grip was trembling. It hadn't tightened. The long muscles in his forearm were jumping.</w:t>
       </w:r>
     </w:p>
     <w:p>
@@ -282,7 +255,7 @@
           <w:b w:val="0"/>
           <w:i w:val="0"/>
         </w:rPr>
-        <w:t>"You are angry at the right person," Flitzberg said, with what throat he was allowed. "Do not let that comfort you. The right person is also the only one who will answer your questions, and a dead man answers nothing."</w:t>
+        <w:t>"You are angry at the right person," Flitzberg got out. He had to stop and swallow, and she watched it go down him like a stone. "The right person is also the only one who will answer you. A dead man answers nothing."</w:t>
       </w:r>
     </w:p>
     <w:p>
@@ -291,7 +264,7 @@
           <w:b w:val="0"/>
           <w:i w:val="0"/>
         </w:rPr>
-        <w:t>Gage's arm shook harder. She knew the war in it: what the body wanted against what the people behind it needed. He'd lost that war in the first room, and she'd told him what it would cost if he lost it again.</w:t>
+        <w:t>Gage's arm shook harder.</w:t>
       </w:r>
     </w:p>
     <w:p>
@@ -300,7 +273,7 @@
           <w:b w:val="0"/>
           <w:i w:val="0"/>
         </w:rPr>
-        <w:t>She tried to say his name. Her mouth made the shape and nothing came up behind it; her chest was a bellows with a hole in it. She wet her lips. Tried again. The sound that came out was small and cracked and close to the floor.</w:t>
+        <w:t>She tried to say his name, and nothing came up behind it. She wet her lips. Tried again.</w:t>
       </w:r>
     </w:p>
     <w:p>
@@ -318,7 +291,7 @@
           <w:b w:val="0"/>
           <w:i w:val="0"/>
         </w:rPr>
-        <w:t>His head turned a quarter inch. That was all he gave her, and it was enough to know he'd heard.</w:t>
+        <w:t>His head turned a quarter inch.</w:t>
       </w:r>
     </w:p>
     <w:p>
@@ -336,7 +309,21 @@
           <w:b w:val="0"/>
           <w:i w:val="0"/>
         </w:rPr>
-        <w:t>She didn't have the breath for the rest of the sentence, and she didn't need it. He'd agreed to it in a red corridor with his hand on her arm, and he had kept it in the first room with a shock still humming in his bones. The hand opened. One finger at a time, as if each had to be persuaded separately. He stepped back. He didn't step far.</w:t>
+        <w:t xml:space="preserve">He'd promised her, outside the four doors: </w:t>
+      </w:r>
+      <w:r>
+        <w:rPr>
+          <w:b w:val="0"/>
+          <w:i/>
+        </w:rPr>
+        <w:t>if I tell you to stop, you stop.</w:t>
+      </w:r>
+      <w:r>
+        <w:rPr>
+          <w:b w:val="0"/>
+          <w:i w:val="0"/>
+        </w:rPr>
+        <w:t xml:space="preserve"> He'd kept it once already, with a shock still humming in his bones. His hand opened, one finger at a time, as if each one had to be argued with separately. He stepped back. Not far.</w:t>
       </w:r>
     </w:p>
     <w:p>
@@ -345,7 +332,7 @@
           <w:b w:val="0"/>
           <w:i w:val="0"/>
         </w:rPr>
-        <w:t>Flitzberg breathed. He didn't rub his throat yet. He let the mark sit there where they could see it.</w:t>
+        <w:t>Flitzberg didn't rub his throat. He left the marks where they could see them.</w:t>
       </w:r>
     </w:p>
     <w:p>
@@ -363,7 +350,7 @@
           <w:b w:val="0"/>
           <w:i w:val="0"/>
         </w:rPr>
-        <w:t>"Nothing," Flitzberg said. "You were not punished. You were chosen. I understand that from where you stand the two are difficult to tell apart. That is the fault of the city that raised you, and it is a fair complaint, and I will hear all of it. But first your sister needs more than a spray can."</w:t>
+        <w:t>"Nothing." Flitzberg's voice came out scraped. "You were not —" He stopped, and swallowed, and it cost him. "You were not punished. You were chosen. I know those look the same from where you stand. Your sister needs more than a spray can. Then you can hate me properly."</w:t>
       </w:r>
     </w:p>
     <w:p>
@@ -372,7 +359,7 @@
           <w:b w:val="0"/>
           <w:i w:val="0"/>
         </w:rPr>
-        <w:t>He raised one hand, slowly, where everyone could see it, and beckoned toward the glass.</w:t>
+        <w:t>He raised one hand where they could all see it and beckoned at the glass.</w:t>
       </w:r>
     </w:p>
     <w:p>
@@ -381,7 +368,7 @@
           <w:b w:val="0"/>
           <w:i w:val="0"/>
         </w:rPr>
-        <w:t>The door opened. Three of them came in, two with a wheeled stretcher, one carrying cases. They wore something softer than the guards' uniforms, sleeves pushed up. Ben was between them and Camilla before the door had finished opening. He still had the can.</w:t>
+        <w:t>Three people came in fast, two with a wheeled stretcher, one with cases, sleeves pushed up. Ben was between them and Camilla before the door finished opening, the can held up like a weapon.</w:t>
       </w:r>
     </w:p>
     <w:p>
@@ -390,7 +377,7 @@
           <w:b w:val="0"/>
           <w:i w:val="0"/>
         </w:rPr>
-        <w:t>The oldest of the three stopped. A woman, grey at the temples, hands scrubbed pink to the wrist. She set her case on the floor, opened it, and turned it so the whole interior faced Ben.</w:t>
+        <w:t>The oldest of them, a woman with grey at her temples and hands scrubbed pink, stopped dead. She set her case on the floor, opened it and turned it so Ben could see inside.</w:t>
       </w:r>
     </w:p>
     <w:p>
@@ -399,7 +386,7 @@
           <w:b w:val="0"/>
           <w:i w:val="0"/>
         </w:rPr>
-        <w:t>"Clean sealant," she said. "Blood volume. Pain control that will not fog her. You may walk beside the stretcher with your hand on her shoulder the whole way. We have done this before, and we have never once needed a family member to let go."</w:t>
+        <w:t>"Clean sealant. Blood. Pain control that won't fog her." She didn't move toward Camilla. "You can walk next to the stretcher with your hand on her the whole way. Nobody's going to make you let go."</w:t>
       </w:r>
     </w:p>
     <w:p>
@@ -408,7 +395,7 @@
           <w:b w:val="0"/>
           <w:i w:val="0"/>
         </w:rPr>
-        <w:t>Camilla, on the floor, had the better angle. She read the case the way she'd have read any case left open in front of her. Two cans like Ben's but sleeker, with a collar at the nozzle. Flat bags of something clear, a line coiled under each. A tray of sealed instruments, every one of them bright. Nothing she had ever owned had been bright. Including the arm.</w:t>
+        <w:t>Ben looked at Gage. Gage looked at the case. Camilla looked too: sealed instruments in fitted foam, every one of them bright. Nothing she'd ever owned had been bright.</w:t>
       </w:r>
     </w:p>
     <w:p>
@@ -417,7 +404,7 @@
           <w:b w:val="0"/>
           <w:i w:val="0"/>
         </w:rPr>
-        <w:t>Ben looked at Gage. Gage looked at the case. Something in his exhaustion made the decision his pride couldn't, and he nodded once.</w:t>
+        <w:t>Gage nodded.</w:t>
       </w:r>
     </w:p>
     <w:p>
@@ -426,7 +413,7 @@
           <w:b w:val="0"/>
           <w:i w:val="0"/>
         </w:rPr>
-        <w:t>The two with the stretcher came forward and bent to her.</w:t>
+        <w:t>The two with the stretcher bent to her.</w:t>
       </w:r>
     </w:p>
     <w:p>
@@ -435,7 +422,7 @@
           <w:b w:val="0"/>
           <w:i w:val="0"/>
         </w:rPr>
-        <w:t>"No."</w:t>
+        <w:t>"No," Camilla said. "Him first." She couldn't lift the arm she wanted to lift, so she lifted the other one, two inches off the floor, and let it fall toward Otto. "Him. Then me."</w:t>
       </w:r>
     </w:p>
     <w:p>
@@ -444,21 +431,7 @@
           <w:b w:val="0"/>
           <w:i w:val="0"/>
         </w:rPr>
-        <w:t xml:space="preserve">It came out louder than </w:t>
-      </w:r>
-      <w:r>
-        <w:rPr>
-          <w:b w:val="0"/>
-          <w:i/>
-        </w:rPr>
-        <w:t>stop</w:t>
-      </w:r>
-      <w:r>
-        <w:rPr>
-          <w:b w:val="0"/>
-          <w:i w:val="0"/>
-        </w:rPr>
-        <w:t xml:space="preserve"> had, which still wasn't loud. The nearest medic paused with his hands under her shoulders.</w:t>
+        <w:t>The medic looked at the boy standing in the middle of the room breathing like a sleeper. She said one word to the third medic, who took a light and a grey instrument to Otto.</w:t>
       </w:r>
     </w:p>
     <w:p>
@@ -467,25 +440,7 @@
           <w:b w:val="0"/>
           <w:i w:val="0"/>
         </w:rPr>
-        <w:t>"Him first." She couldn't lift the arm she wanted to lift. She lifted the other one, the right, two inches off the floor, and let it fall toward Otto. "Him. Then me."</w:t>
-      </w:r>
-    </w:p>
-    <w:p>
-      <w:r>
-        <w:rPr>
-          <w:b w:val="0"/>
-          <w:i w:val="0"/>
-        </w:rPr>
-        <w:t>The oldest medic looked where the hand had pointed. She looked at the boy standing in the middle of the room breathing like a sleeper, and her face did a thing Camilla had seen on Rita's once, at the gates. She said one word to the third medic, who took a light and a flat grey instrument from the second case and crossed to Otto.</w:t>
-      </w:r>
-    </w:p>
-    <w:p>
-      <w:r>
-        <w:rPr>
-          <w:b w:val="0"/>
-          <w:i w:val="0"/>
-        </w:rPr>
-        <w:t>"On the floor, then," she said to Camilla. "We will do you here while he is seen. You will hold still for me."</w:t>
+        <w:t>"Then we do you here," she told Camilla, and knelt. "Hold still."</w:t>
       </w:r>
     </w:p>
     <w:p>
@@ -503,7 +458,7 @@
           <w:b w:val="0"/>
           <w:i w:val="0"/>
         </w:rPr>
-        <w:t>The medic knelt. She didn't touch the seal Ben had made. She looked at it, turned her own can so Camilla could see the nozzle, and waited the half-second it took Camilla's eyes to ask.</w:t>
+        <w:t>The new sealant went on over Ben's, colder and deeper, and under it came the first warmth her shoulder had given her since the drone. A line went into the back of her right hand. The clear bag above her started to empty. For a while nothing changed, and then everything did: the room's edges came back sharp.</w:t>
       </w:r>
     </w:p>
     <w:p>
@@ -512,7 +467,7 @@
           <w:b w:val="0"/>
           <w:i w:val="0"/>
         </w:rPr>
-        <w:t>"Two chambers," she said. "They meet in the air and set on contact with blood. His will hold until morning. Mine goes over it so that it holds longer." Then she sprayed. The cold came again, deeper, and under it the first warmth the shoulder had given her since the railing. A line went into the back of her right hand with a sting smaller than the one in the beds. She watched the clear bag start to empty and felt nothing change, and then felt everything change, the room's edges coming back in sharp.</w:t>
+        <w:t>Across the room, the third medic shone the light in Otto's eyes. Left, right. His pupils did what pupils do. His face did nothing. The instrument went to his neck, his wrist, his chest. The medic looked at Flitzberg and didn't need to say anything.</w:t>
       </w:r>
     </w:p>
     <w:p>
@@ -521,7 +476,7 @@
           <w:b w:val="0"/>
           <w:i w:val="0"/>
         </w:rPr>
-        <w:t>Across the room, the third medic shone a light into Otto's eyes. Left. Right. His pupils did what pupils do; his face did nothing. The instrument went to his neck, his wrist, flat against his chest. The medic checked it once more and looked at Flitzberg with an expression that was its own report.</w:t>
+        <w:t>"What's wrong with him?" Ben's voice cracked. "He's right there. He's breathing. Why won't he come back?"</w:t>
       </w:r>
     </w:p>
     <w:p>
@@ -530,16 +485,7 @@
           <w:b w:val="0"/>
           <w:i w:val="0"/>
         </w:rPr>
-        <w:t>"What is wrong with him?" Ben's voice cracked on the last word. "He's right there. He's breathing. Why won't he come back?"</w:t>
-      </w:r>
-    </w:p>
-    <w:p>
-      <w:r>
-        <w:rPr>
-          <w:b w:val="0"/>
-          <w:i w:val="0"/>
-        </w:rPr>
-        <w:t>Flitzberg looked past Ben to Otto, the boy who had held ten stones open over a lake of fire.</w:t>
+        <w:t>Flitzberg looked past him at Otto, the boy who'd held ten stones open over a lake of fire.</w:t>
       </w:r>
     </w:p>
     <w:p>
@@ -557,7 +503,7 @@
           <w:b w:val="0"/>
           <w:i w:val="0"/>
         </w:rPr>
-        <w:t>"You did this —"</w:t>
+        <w:t>"You did this."</w:t>
       </w:r>
     </w:p>
     <w:p>
@@ -566,23 +512,7 @@
           <w:b w:val="0"/>
           <w:i w:val="0"/>
         </w:rPr>
-        <w:t>"Yes. And I do not know." He let it stand. "Our instruments say nothing is wrong with him. Heart, breath, the workings of his body, all of it steady, all of it well. By every measure we have, he is unharmed. The instruments are wrong. Some part of your friend spent itself in that room, or went somewhere to pay for what the four of you needed, and it has not come back. We will keep his body strong and his door open. Past that, I will not pretend to a knowledge I do not have. You have been lied to with confidence your whole lives. I will not add to it."</w:t>
-      </w:r>
-    </w:p>
-    <w:p>
-      <w:r>
-        <w:rPr>
-          <w:b w:val="0"/>
-          <w:i/>
-        </w:rPr>
-        <w:t>The instruments are wrong.</w:t>
-      </w:r>
-      <w:r>
-        <w:rPr>
-          <w:b w:val="0"/>
-          <w:i w:val="0"/>
-        </w:rPr>
-        <w:t xml:space="preserve"> Camilla had never heard anyone in a clean coat say it. She looked at Otto's hands. They hung open at his sides, fingers a little curled, the way hands hang when nobody is telling them anything.</w:t>
+        <w:t>"Yes. And I do not know." He let that sit. "Our instruments say he is well. Heart, breath, all of it. The instruments are wrong. Some part of him spent itself in that room, and it has not come back. We will keep his body strong and his door open. I will not pretend to more than that. You have been lied to with confidence your whole lives."</w:t>
       </w:r>
     </w:p>
     <w:p>
@@ -600,7 +530,7 @@
           <w:b w:val="0"/>
           <w:i w:val="0"/>
         </w:rPr>
-        <w:t>"No," Flitzberg agreed. "It is not. It is only true."</w:t>
+        <w:t>"It is what there is."</w:t>
       </w:r>
     </w:p>
     <w:p>
@@ -609,7 +539,7 @@
           <w:b w:val="0"/>
           <w:i w:val="0"/>
         </w:rPr>
-        <w:t>Gage stared at him. Camilla had watched her brother's face do a lot of things in two days, and she didn't have a word for this one. He'd grown up among comfortable lies. He could recognize an uncomfortable truth the way a miner recognizes water, by taste, in the dark.</w:t>
+        <w:t>Gage took a step toward him. Flitzberg didn't take one back.</w:t>
       </w:r>
     </w:p>
     <w:p>
@@ -618,7 +548,7 @@
           <w:b w:val="0"/>
           <w:i w:val="0"/>
         </w:rPr>
-        <w:t>"You have a question standing in line behind that one," Flitzberg said. "Ask it."</w:t>
+        <w:t>"The guard at the doors," Gage said. "'Pass all four, you live. Fail—' He didn't finish. You finish it."</w:t>
       </w:r>
     </w:p>
     <w:p>
@@ -627,7 +557,7 @@
           <w:b w:val="0"/>
           <w:i w:val="0"/>
         </w:rPr>
-        <w:t>"The guard at the four doors." Gage's voice had gone flat. "He said: you pass all four, you live. You fail — and he didn't finish it. Finish it."</w:t>
+        <w:t>"Some who fail die." Flitzberg didn't soften it. "Not by our hand. But the rooms are not theater. That drone was not pretending. When a team breaks in there, the rooms do not get gentler."</w:t>
       </w:r>
     </w:p>
     <w:p>
@@ -636,25 +566,7 @@
           <w:b w:val="0"/>
           <w:i w:val="0"/>
         </w:rPr>
-        <w:t>"Some who fail die," Flitzberg said. "Not by our hand. Understand that exactly. No one is executed in this ring. But the rooms you walked are not theater. The drone that took your sister's arm was not pretending. A test that cannot hurt you cannot measure you. And when a team breaks in those rooms, when it panics, or freezes, or turns on itself, the rooms do not become gentle because the people in them have stopped being able. That is how the deaths happen. Others fail more quietly, and serve this ring in smaller ways. A few are returned to their old lives with a story that explains their absence, and they are watched, kindly but forever, because of what they have seen. That is the finished sentence. You are owed the whole of it, and now you have it."</w:t>
-      </w:r>
-    </w:p>
-    <w:p>
-      <w:r>
-        <w:rPr>
-          <w:b w:val="0"/>
-          <w:i w:val="0"/>
-        </w:rPr>
-        <w:t>The levers in the first room had been worn smooth where other palms had held them. Now she knew the three places those palms had gone.</w:t>
-      </w:r>
-    </w:p>
-    <w:p>
-      <w:r>
-        <w:rPr>
-          <w:b w:val="0"/>
-          <w:i w:val="0"/>
-        </w:rPr>
-        <w:t>"And Camilla's arm? Otto?" Ben was crying and not hiding it. "Was that the price of your test?"</w:t>
+        <w:t>"And Camilla's arm?" Ben was crying now and not hiding it. "And Otto? That was the price?"</w:t>
       </w:r>
     </w:p>
     <w:p>
@@ -672,7 +584,7 @@
           <w:b w:val="0"/>
           <w:i w:val="0"/>
         </w:rPr>
-        <w:t>The word landed alone, with nothing dressed around it. The medic's hands kept working. The bag kept emptying. The line in Camilla's hand was warm now where it had been cold.</w:t>
+        <w:t>The medic's hands kept working. The bag kept emptying.</w:t>
       </w:r>
     </w:p>
     <w:p>
@@ -681,7 +593,7 @@
           <w:b w:val="0"/>
           <w:i w:val="0"/>
         </w:rPr>
-        <w:t>"I could tell you that the mine would have taken more of you, and taken it namelessly, one shift at a time. All of it is true, and tonight it would sound like an excuse, so I will not lean on it. The rooms we built set prices, and when a trial goes wrong, someone pays them. Your sister's arm was such a price. It fell on her, it could have fallen on any of you, and she paid it on her feet, telling the three of you to get back to work while she bled. Do not remember her as someone this place happened to. Remember her as someone who met it standing."</w:t>
+        <w:t>"Your sister paid it on her feet," Flitzberg said. "Remember that, before anything else about tonight."</w:t>
       </w:r>
     </w:p>
     <w:p>
@@ -708,7 +620,7 @@
           <w:b w:val="0"/>
           <w:i w:val="0"/>
         </w:rPr>
-        <w:t>"Don't make it a story." Her voice shook, and she let it. "I didn't meet anything. I counted. Somebody had to count."</w:t>
+        <w:t>"Don't make it a story." Her voice shook and she let it. "I didn't meet anything. I counted. Somebody had to count."</w:t>
       </w:r>
     </w:p>
     <w:p>
@@ -717,7 +629,7 @@
           <w:b w:val="0"/>
           <w:i w:val="0"/>
         </w:rPr>
-        <w:t>Flitzberg was quiet. Then he nodded once, the way a man nods when he's been corrected and knows it, and turned back to the boys.</w:t>
+        <w:t>"And somebody had to pay," Flitzberg said. "Both of those are true. I will not take either one back to make this easier for you."</w:t>
       </w:r>
     </w:p>
     <w:p>
@@ -726,7 +638,7 @@
           <w:b w:val="0"/>
           <w:i w:val="0"/>
         </w:rPr>
-        <w:t>"And your friend is the other half of the same lesson. His price no one set on him. He saw it coming, counted it, and reached for it himself. Both of those costs belong to this office, and this office does not pretend otherwise. What I can tell you is what the costs purchased. You were not being tortured. You were being read. And what we read in the four of you, we have been looking for, in this ring, for a very long time."</w:t>
+        <w:t>Nobody had ever told her no and meant it kindly. She didn't know what to do with her face.</w:t>
       </w:r>
     </w:p>
     <w:p>
@@ -735,7 +647,7 @@
           <w:b w:val="0"/>
           <w:i w:val="0"/>
         </w:rPr>
-        <w:t>"Read for what?" Gage said. "You keep talking around it. The voice said we're ready. Ready for what? You said freedom. Birthright. What does that mean?"</w:t>
+        <w:t>Gage turned to the door they'd come in by. "We're going home."</w:t>
       </w:r>
     </w:p>
     <w:p>
@@ -744,7 +656,7 @@
           <w:b w:val="0"/>
           <w:i w:val="0"/>
         </w:rPr>
-        <w:t>Flitzberg was quiet again. Camilla had watched Pappy go quiet like that over a part he was deciding whether to hand to a child, weighing rather than searching.</w:t>
+        <w:t>"Not tonight."</w:t>
       </w:r>
     </w:p>
     <w:p>
@@ -753,7 +665,7 @@
           <w:b w:val="0"/>
           <w:i w:val="0"/>
         </w:rPr>
-        <w:t>"There was a time," he said, "when the people of this region moved where they chose, sold what they dug, and had a say in who set their quotas. I am not telling you a legend. The records of it still exist — deeds, charters, pay-books, rolls of names — old enough that the city above has stopped guarding them. What changed did not change in a day. It came in stages, and every stage was signed: an emergency measure here, a safety regulation there, a lottery introduced as a mercy. Nobody stole your freedom in the night, boys. It was transferred, lawfully, gradually, in documents, and a transfer always has paperwork. That is the birthright I named. Not a dream. A property, with a record of exactly how it left your family's hands."</w:t>
+        <w:t>"You don't get to say—"</w:t>
       </w:r>
     </w:p>
     <w:p>
@@ -762,7 +674,21 @@
           <w:b w:val="0"/>
           <w:i w:val="0"/>
         </w:rPr>
-        <w:t>Ben had gone still. She knew the stillness; she'd watched it across the shack while he coaxed a coil back to life. Ben, going quiet while his mind ran a pattern to its end.</w:t>
+        <w:t xml:space="preserve">"In four days," Flitzberg said, and his voice gave out on him again, and he made it work, "the mine will write one word next to your three names. </w:t>
+      </w:r>
+      <w:r>
+        <w:rPr>
+          <w:b w:val="0"/>
+          <w:i/>
+        </w:rPr>
+        <w:t>Absconded.</w:t>
+      </w:r>
+      <w:r>
+        <w:rPr>
+          <w:b w:val="0"/>
+          <w:i w:val="0"/>
+        </w:rPr>
+        <w:t xml:space="preserve"> Your slots go back in the pool. Camilla's ration card stops being drawn the same morning, and nobody asks why. Miner Town does not go looking for children who walk away. It goes looking for the ones who come back." He swallowed. "Walk out of here tonight, bleeding, with no story, and you are the trouble the city bills your street for. Rations short. Quotas up. Somebody's door kicked in who had nothing to do with you."</w:t>
       </w:r>
     </w:p>
     <w:p>
@@ -771,7 +697,7 @@
           <w:b w:val="0"/>
           <w:i w:val="0"/>
         </w:rPr>
-        <w:t>"Paper," he said at last, and there was no hope in it. "You can show a man the deed to his own house while he stands in the rain outside it. The people who signed those papers own the offices where papers matter. They own the clerks who read them and the guards at the doors. Knowing how it was taken tells us everything — and gets us nothing. There's no counter in Miner Town where you can stand in line and ask for your freedom back."</w:t>
+        <w:t>Ben's head came up. "Gretchen's at the gates. She'll be there tomorrow. She'll be there every day."</w:t>
       </w:r>
     </w:p>
     <w:p>
@@ -780,7 +706,7 @@
           <w:b w:val="0"/>
           <w:i w:val="0"/>
         </w:rPr>
-        <w:t>"Correct," Flitzberg said. "You cannot appeal to them; they own the places where appeals are heard. And you cannot rise against them, for a harder reason. Think of what happens in Miner Town after any trouble. Rations shorten. Quotas climb. Examples are made in the shack-rows, of people who had nothing to do with the trouble at all. The city above does not fight its challengers. It bills their neighbors."</w:t>
+        <w:t>"I know."</w:t>
       </w:r>
     </w:p>
     <w:p>
@@ -789,7 +715,7 @@
           <w:b w:val="0"/>
           <w:i w:val="0"/>
         </w:rPr>
-        <w:t>Camilla had the map of that already. Nursery Row, fifteen families at the base of the coal mound, old Marta teaching letters off danger signs.</w:t>
+        <w:t>"Then tell her."</w:t>
       </w:r>
     </w:p>
     <w:p>
@@ -798,7 +724,7 @@
           <w:b w:val="0"/>
           <w:i w:val="0"/>
         </w:rPr>
-        <w:t>"Then what's left?" Gage said. "If we can't ask and we can't fight, what is this place? What are you?"</w:t>
+        <w:t>"I cannot send word up. Nothing goes up that the ground could read." Flitzberg looked away from them, at the glass. He hadn't done that yet. "I am sorry. That is not a thing I can fix tonight."</w:t>
       </w:r>
     </w:p>
     <w:p>
@@ -807,7 +733,7 @@
           <w:b w:val="0"/>
           <w:i w:val="0"/>
         </w:rPr>
-        <w:t>"The answer to that question is a long one, and it is owed to you whole: what this place is, how it came to be, and what it wants with the four of you. You will have all of it. But not tonight. I am not hiding it from you. I am saving it for when you can weigh it."</w:t>
+        <w:t>Gage's hands had closed. Camilla watched them close.</w:t>
       </w:r>
     </w:p>
     <w:p>
@@ -816,7 +742,7 @@
           <w:b w:val="0"/>
           <w:i w:val="0"/>
         </w:rPr>
-        <w:t>Gage stared at him, and some of the stare was refusal. Then Ben swayed on his knees and put a hand down to the floor, and the refusal went out of it. None of them had anything left. She could have told him that two rooms ago.</w:t>
+        <w:t>"And this birthright," he said. "Say what it means or I'm walking."</w:t>
       </w:r>
     </w:p>
     <w:p>
@@ -825,7 +751,7 @@
           <w:b w:val="0"/>
           <w:i w:val="0"/>
         </w:rPr>
-        <w:t>The medic clipped the line and taped it flat against the back of her hand. "That stays in. You will be stronger by morning, and you will be angry about the tape. Both are acceptable." She nodded to the other two. "Now."</w:t>
+        <w:t>"It means there are papers." Flitzberg kept it short; he had to. "Old ones, signed. Your families could once move, sell what they dug, choose who set the quotas. Nobody stole that in the night. It was signed away, one rule at a time. Signatures leave records."</w:t>
       </w:r>
     </w:p>
     <w:p>
@@ -834,7 +760,7 @@
           <w:b w:val="0"/>
           <w:i w:val="0"/>
         </w:rPr>
-        <w:t>They lifted her. It was the lifting Camilla would remember afterward, more than the words: four hands under her, no part of her left to find its own way, nothing jarred. Nobody in Miner Town lifted a miner's body like that. Lou's people didn't lift. They dragged.</w:t>
+        <w:t>Ben laughed, once, wet and ugly. "So there's a piece of paper. Great. Who do we show it to? The guards?" He wiped his face with his wrist. "There's no counter in Miner Town where you line up and ask for your freedom back."</w:t>
       </w:r>
     </w:p>
     <w:p>
@@ -843,7 +769,7 @@
           <w:b w:val="0"/>
           <w:i w:val="0"/>
         </w:rPr>
-        <w:t>Ben came with her, his hand on her good shoulder, the way he'd been told he could. Gage didn't move yet. He was looking at Otto.</w:t>
+        <w:t>"No," Flitzberg said. "There is not. Which is why the rest of it is long."</w:t>
       </w:r>
     </w:p>
     <w:p>
@@ -852,7 +778,7 @@
           <w:b w:val="0"/>
           <w:i w:val="0"/>
         </w:rPr>
-        <w:t>Flitzberg turned toward the inner doors, stopped, and said the rest without turning back.</w:t>
+        <w:t>Gage opened his mouth.</w:t>
       </w:r>
     </w:p>
     <w:p>
@@ -861,7 +787,7 @@
           <w:b w:val="0"/>
           <w:i w:val="0"/>
         </w:rPr>
-        <w:t>"You wanted to know what you ever did to us. Nothing. Hold on to that. The rest can wait." The doors opened on a corridor, and the lights in it came up one at a time, each a step ahead of the last, reaching off into the dark. "Tonight, eat. Sleep. Sit with your friend, and speak to him. For all our instruments can tell, he may hear every word. Your sister will be stronger by morning. And the answers will still be here when you wake. They have waited almost a century. They can wait one more night."</w:t>
+        <w:t>"Gage." Camilla got her good elbow under herself. It took two tries. "Look at Otto. Look at Ben."</w:t>
       </w:r>
     </w:p>
     <w:p>
@@ -870,7 +796,7 @@
           <w:b w:val="0"/>
           <w:i w:val="0"/>
         </w:rPr>
-        <w:t>The stretcher turned, and from it, flat on her back, Camilla got the room one last time.</w:t>
+        <w:t>Ben was swaying where he knelt. He put a hand down on the floor to stop it.</w:t>
       </w:r>
     </w:p>
     <w:p>
@@ -879,7 +805,88 @@
           <w:b w:val="0"/>
           <w:i w:val="0"/>
         </w:rPr>
-        <w:t>Gage went to Otto. He said Otto's name once, quietly, and got nothing back. Then he bent, took Otto's arm across his shoulders, and lifted him, and Camilla had the strangest feeling of the world folding over on itself. She had seen this before: outside the mine gates on the fourth morning, Gage walking out of the dark with Otto across his shoulders and Ben by the collar, while the guards waited for a broken boy who never came.</w:t>
+        <w:t>"We stay," she said. "Tonight. He talks tomorrow, all of it. And if he doesn't, we walk, and you can carry me."</w:t>
+      </w:r>
+    </w:p>
+    <w:p>
+      <w:r>
+        <w:rPr>
+          <w:b w:val="0"/>
+          <w:i w:val="0"/>
+        </w:rPr>
+        <w:t>Gage looked at her for a long time. Then his hands came open, slowly, the way they had at the man's throat.</w:t>
+      </w:r>
+    </w:p>
+    <w:p>
+      <w:r>
+        <w:rPr>
+          <w:b w:val="0"/>
+          <w:i w:val="0"/>
+        </w:rPr>
+        <w:t>"Tomorrow," he said to Flitzberg. "All of it."</w:t>
+      </w:r>
+    </w:p>
+    <w:p>
+      <w:r>
+        <w:rPr>
+          <w:b w:val="0"/>
+          <w:i w:val="0"/>
+        </w:rPr>
+        <w:t>"All of it," Flitzberg said. "You have my word, which you have no reason yet to value."</w:t>
+      </w:r>
+    </w:p>
+    <w:p>
+      <w:r>
+        <w:rPr>
+          <w:b w:val="0"/>
+          <w:i w:val="0"/>
+        </w:rPr>
+        <w:t>The medic taped the line flat against Camilla's hand. "That stays in. You'll be stronger by morning, and you'll hate the tape. Both are fine." She nodded to the others. "Now."</w:t>
+      </w:r>
+    </w:p>
+    <w:p>
+      <w:r>
+        <w:rPr>
+          <w:b w:val="0"/>
+          <w:i w:val="0"/>
+        </w:rPr>
+        <w:t>They lifted her: four hands under her, nothing jarred, nothing left to find its own way. Nobody in Miner Town had ever lifted a miner's body like that. Ben came with her, his hand on her good shoulder, exactly as he'd been told he could.</w:t>
+      </w:r>
+    </w:p>
+    <w:p>
+      <w:r>
+        <w:rPr>
+          <w:b w:val="0"/>
+          <w:i w:val="0"/>
+        </w:rPr>
+        <w:t>Flitzberg went to the inner doors. They opened on a corridor, and the lights woke one at a time ahead of them, each a step beyond the last.</w:t>
+      </w:r>
+    </w:p>
+    <w:p>
+      <w:r>
+        <w:rPr>
+          <w:b w:val="0"/>
+          <w:i w:val="0"/>
+        </w:rPr>
+        <w:t>"Eat," he said. "Sleep. Sit with your friend and talk to him. For all our instruments can tell, he hears every word."</w:t>
+      </w:r>
+    </w:p>
+    <w:p>
+      <w:r>
+        <w:rPr>
+          <w:b w:val="0"/>
+          <w:i w:val="0"/>
+        </w:rPr>
+        <w:t>From the stretcher, flat on her back, Camilla got the room one last time.</w:t>
+      </w:r>
+    </w:p>
+    <w:p>
+      <w:r>
+        <w:rPr>
+          <w:b w:val="0"/>
+          <w:i w:val="0"/>
+        </w:rPr>
+        <w:t>Gage went to Otto. He said Otto's name once and got nothing back. Then he bent, took Otto's arm across his shoulders, and lifted him, and Camilla had the strangest feeling of the world folding over on itself. She'd seen this before: outside the mine gates on the fourth morning, Gage walking up out of the dark with Otto across his shoulders and Ben by the collar, while the guards waited for a broken boy who never came.</w:t>
       </w:r>
     </w:p>
     <w:p>
@@ -897,7 +904,7 @@
           <w:b w:val="0"/>
           <w:i w:val="0"/>
         </w:rPr>
-        <w:t>Gage, with the mark of his own hand still on another man's neck, looking at her over Otto's slack head. Ben beside her, looking at her. Flitzberg, hands folded, looking at her the way he looked at everything, as a reading he intended to keep. And Otto, chest rising, chest falling, eyes on nothing at all.</w:t>
+        <w:t>She counted them through the door. Gage, with Otto on his back. Ben, beside her. Herself.</w:t>
       </w:r>
     </w:p>
     <w:p>
@@ -906,7 +913,7 @@
           <w:b w:val="0"/>
           <w:i w:val="0"/>
         </w:rPr>
-        <w:t>Four faces. Three looking back.</w:t>
+        <w:t>Four of them. Three awake.</w:t>
       </w:r>
     </w:p>
     <w:p>
@@ -915,7 +922,7 @@
           <w:b w:val="0"/>
           <w:i w:val="0"/>
         </w:rPr>
-        <w:t>She'd count again in the morning. She would keep counting until it was four.</w:t>
+        <w:t>She'd count again in the morning. She'd keep counting until it was four.</w:t>
       </w:r>
     </w:p>
     <w:p>
@@ -924,7 +931,7 @@
           <w:b w:val="0"/>
           <w:i w:val="0"/>
         </w:rPr>
-        <w:t>Then the corridor took her, and the lights woke ahead of the stretcher, one and then the next and then the next, running on into the dark faster than anyone could walk.</w:t>
+        <w:t>Then the corridor took her, and the lights woke ahead of the stretcher, running on into the dark faster than anyone could walk.</w:t>
       </w:r>
     </w:p>
     <w:sectPr>

</xml_diff>

<commit_message>
Ch2 round 2: cut the birthright stall, make "Absconded" a clock
Cut the birthright exchange and plant the papers in the opening ("Ask what
was taken from your parents, and who signed for it"). "Absconded" becomes a
four-day deadline and a protection ("the kindest word it has... Before
then, you choose"), setting up Ch6's "story that holds". Cut Flitzberg's
fortune-cookie lines, gloss the ten stones, trim the promise recap, "In
Miner Town you got dragged". Ch6: Ben's Gretchen line becomes a callback.
Opus/Fable drafts combined; blind reviews prefer it (Sonnet 8 vs 7.5,
Haiku 7 vs 6). Regenerate both Word files.

Co-Authored-By: Claude Opus 5.5 <noreply@anthropic.com>
</commit_message>
<xml_diff>
--- a/claude-notes/manuscript-v2/02-now-the-throat-merged.docx
+++ b/claude-notes/manuscript-v2/02-now-the-throat-merged.docx
@@ -20,6 +20,7 @@
         <w:rPr>
           <w:b w:val="0"/>
           <w:i/>
+          <w:strike w:val="0"/>
           <w:color w:val="5C6B7D"/>
         </w:rPr>
         <w:t>“If I tell you to stop, you stop. Even if every part of you is screaming to charge. You stop.”</w:t>
@@ -30,6 +31,7 @@
         <w:rPr>
           <w:b w:val="0"/>
           <w:i/>
+          <w:strike w:val="0"/>
           <w:color w:val="5C6B7D"/>
         </w:rPr>
         <w:t>— Book 1, Chapter 22: The Engine and Eyes</w:t>
@@ -49,6 +51,7 @@
         <w:rPr>
           <w:b w:val="0"/>
           <w:i w:val="0"/>
+          <w:strike w:val="0"/>
         </w:rPr>
         <w:t>Cold first. Metal floor, flat against her shoulder blade and the back of her skull. Then a second cold, smaller and wetter, on the place where her left arm stopped. Fresh sealant. It hadn't set yet; it still had the chill of the can in it. Thick at the front, thin at the back. Whoever had sprayed it had been shaking, and hadn't wanted to look.</w:t>
       </w:r>
@@ -58,6 +61,7 @@
         <w:rPr>
           <w:b w:val="0"/>
           <w:i w:val="0"/>
+          <w:strike w:val="0"/>
         </w:rPr>
         <w:t>Ben, then. Gage didn't shake when he worked. Gage pressed too hard.</w:t>
       </w:r>
@@ -67,6 +71,7 @@
         <w:rPr>
           <w:b w:val="0"/>
           <w:i w:val="0"/>
+          <w:strike w:val="0"/>
         </w:rPr>
         <w:t>Her left hand closed. She felt the fingers curl, the thumb come across the knuckles, the small pull in the forearm. None of it was there. She'd explained this once to Gerald, back home, about the leg he didn't have anymore: the map stays drawn after the country's gone. She hadn't known what it felt like from the inside. She let the hand that didn't exist stay closed. She'd deal with it later.</w:t>
       </w:r>
@@ -76,6 +81,7 @@
         <w:rPr>
           <w:b w:val="0"/>
           <w:i w:val="0"/>
+          <w:strike w:val="0"/>
         </w:rPr>
         <w:t>Voices came before her eyes did.</w:t>
       </w:r>
@@ -85,6 +91,7 @@
         <w:rPr>
           <w:b w:val="0"/>
           <w:i w:val="0"/>
+          <w:strike w:val="0"/>
         </w:rPr>
         <w:t>"Why?" Her brother, cracked down the middle. "Otto is here and still gone. Camilla is half-dead. What did we ever do to you?"</w:t>
       </w:r>
@@ -94,6 +101,7 @@
         <w:rPr>
           <w:b w:val="0"/>
           <w:i/>
+          <w:strike w:val="0"/>
         </w:rPr>
         <w:t>Half-dead.</w:t>
       </w:r>
@@ -101,6 +109,7 @@
         <w:rPr>
           <w:b w:val="0"/>
           <w:i w:val="0"/>
+          <w:strike w:val="0"/>
         </w:rPr>
         <w:t xml:space="preserve"> So that was how she looked from up there.</w:t>
       </w:r>
@@ -110,8 +119,9 @@
         <w:rPr>
           <w:b w:val="0"/>
           <w:i w:val="0"/>
+          <w:strike w:val="0"/>
         </w:rPr>
-        <w:t>"The question is not what I did to you." Smooth, made, even. "The question is: what will you do to regain the freedom that was once your birthright?"</w:t>
+        <w:t>"Wrong question." Smooth, made, even. "Ask what was taken from your parents, and who signed for it."</w:t>
       </w:r>
     </w:p>
     <w:p>
@@ -119,6 +129,7 @@
         <w:rPr>
           <w:b w:val="0"/>
           <w:i w:val="0"/>
+          <w:strike w:val="0"/>
         </w:rPr>
         <w:t>"What does that mean?" Ben, from somewhere low and close.</w:t>
       </w:r>
@@ -128,8 +139,9 @@
         <w:rPr>
           <w:b w:val="0"/>
           <w:i w:val="0"/>
+          <w:strike w:val="0"/>
         </w:rPr>
-        <w:t>"You are ready now. Ready for the journey ahead."</w:t>
+        <w:t>"That somebody signed. Signatures leave records. You are ready now to read them."</w:t>
       </w:r>
     </w:p>
     <w:p>
@@ -137,6 +149,7 @@
         <w:rPr>
           <w:b w:val="0"/>
           <w:i w:val="0"/>
+          <w:strike w:val="0"/>
         </w:rPr>
         <w:t>Then someone was choking.</w:t>
       </w:r>
@@ -146,6 +159,7 @@
         <w:rPr>
           <w:b w:val="0"/>
           <w:i w:val="0"/>
+          <w:strike w:val="0"/>
         </w:rPr>
         <w:t>She opened her eyes.</w:t>
       </w:r>
@@ -155,6 +169,7 @@
         <w:rPr>
           <w:b w:val="0"/>
           <w:i w:val="0"/>
+          <w:strike w:val="0"/>
         </w:rPr>
         <w:t>White light, everywhere, the kind that didn't flicker because nothing was burning to make it. She turned her head on the floor and took the room in a piece at a time.</w:t>
       </w:r>
@@ -164,6 +179,7 @@
         <w:rPr>
           <w:b w:val="0"/>
           <w:i w:val="0"/>
+          <w:strike w:val="0"/>
         </w:rPr>
         <w:t>Gage, back to her, feet planted, all two hundred and twenty pounds of him set behind one arm, and at the end of the arm a hand, and in the hand Mr. Flitzberg's throat.</w:t>
       </w:r>
@@ -173,6 +189,7 @@
         <w:rPr>
           <w:b w:val="0"/>
           <w:i w:val="0"/>
+          <w:strike w:val="0"/>
         </w:rPr>
         <w:t>Flitzberg hadn't moved. Hands at his sides. His face was going a bad color, but his eyes were still doing what they always did, which was measure. He wasn't reaching for Gage's wrist.</w:t>
       </w:r>
@@ -182,6 +199,7 @@
         <w:rPr>
           <w:b w:val="0"/>
           <w:i w:val="0"/>
+          <w:strike w:val="0"/>
         </w:rPr>
         <w:t>Ben, on his knees two body-lengths away, the spray can still in his fist.</w:t>
       </w:r>
@@ -191,6 +209,7 @@
         <w:rPr>
           <w:b w:val="0"/>
           <w:i w:val="0"/>
+          <w:strike w:val="0"/>
         </w:rPr>
         <w:t>Otto. Standing, square to the room, arms at his sides. Chest rising, chest falling. Eyes open, and nothing behind them. He was looking at the far wall, and only at the wall.</w:t>
       </w:r>
@@ -200,6 +219,7 @@
         <w:rPr>
           <w:b w:val="0"/>
           <w:i w:val="0"/>
+          <w:strike w:val="0"/>
         </w:rPr>
         <w:t>Behind him, the crystal. Three quarters green. The last quarter pulsing a slow, cold blue.</w:t>
       </w:r>
@@ -209,6 +229,7 @@
         <w:rPr>
           <w:b w:val="0"/>
           <w:i w:val="0"/>
+          <w:strike w:val="0"/>
         </w:rPr>
         <w:t>She counted, because counting was what she did when nothing else would hold still. Gage. Ben. Otto. Her. Four of them. And Flitzberg.</w:t>
       </w:r>
@@ -218,6 +239,7 @@
         <w:rPr>
           <w:b w:val="0"/>
           <w:i w:val="0"/>
+          <w:strike w:val="0"/>
         </w:rPr>
         <w:t>She checked his jaw. The first time they'd met, he'd been wearing her dead grandfather's face, and a seam of light at the hinge had given him away. No seam now. Pale, smooth, full-cheeked, darkening under Gage's hand. His own face, she thought. Probably.</w:t>
       </w:r>
@@ -227,6 +249,7 @@
         <w:rPr>
           <w:b w:val="0"/>
           <w:i w:val="0"/>
+          <w:strike w:val="0"/>
         </w:rPr>
         <w:t>There were no guards in the room. Nobody behind the glass was moving. The man who ran this place had walked in alone and let the strongest boy in Sector One get a hand on his windpipe. Either he'd lost his mind, or he wanted to be within reach.</w:t>
       </w:r>
@@ -236,6 +259,7 @@
         <w:rPr>
           <w:b w:val="0"/>
           <w:i w:val="0"/>
+          <w:strike w:val="0"/>
         </w:rPr>
         <w:t>She didn't think he'd lost his mind.</w:t>
       </w:r>
@@ -245,6 +269,7 @@
         <w:rPr>
           <w:b w:val="0"/>
           <w:i w:val="0"/>
+          <w:strike w:val="0"/>
         </w:rPr>
         <w:t>Gage's grip was trembling. It hadn't tightened. The long muscles in his forearm were jumping.</w:t>
       </w:r>
@@ -254,8 +279,9 @@
         <w:rPr>
           <w:b w:val="0"/>
           <w:i w:val="0"/>
+          <w:strike w:val="0"/>
         </w:rPr>
-        <w:t>"You are angry at the right person," Flitzberg got out. He had to stop and swallow, and she watched it go down him like a stone. "The right person is also the only one who will answer you. A dead man answers nothing."</w:t>
+        <w:t>"You are angry at the right person," Flitzberg got out. He had to stop and swallow, and she watched it go down him like a stone. "The right person is also the only one who will answer you. That is why I came in alone."</w:t>
       </w:r>
     </w:p>
     <w:p>
@@ -263,6 +289,7 @@
         <w:rPr>
           <w:b w:val="0"/>
           <w:i w:val="0"/>
+          <w:strike w:val="0"/>
         </w:rPr>
         <w:t>Gage's arm shook harder.</w:t>
       </w:r>
@@ -272,6 +299,7 @@
         <w:rPr>
           <w:b w:val="0"/>
           <w:i w:val="0"/>
+          <w:strike w:val="0"/>
         </w:rPr>
         <w:t>She tried to say his name, and nothing came up behind it. She wet her lips. Tried again.</w:t>
       </w:r>
@@ -281,6 +309,7 @@
         <w:rPr>
           <w:b w:val="0"/>
           <w:i w:val="0"/>
+          <w:strike w:val="0"/>
         </w:rPr>
         <w:t>"Gage."</w:t>
       </w:r>
@@ -290,6 +319,7 @@
         <w:rPr>
           <w:b w:val="0"/>
           <w:i w:val="0"/>
+          <w:strike w:val="0"/>
         </w:rPr>
         <w:t>His head turned a quarter inch.</w:t>
       </w:r>
@@ -299,6 +329,7 @@
         <w:rPr>
           <w:b w:val="0"/>
           <w:i w:val="0"/>
+          <w:strike w:val="0"/>
         </w:rPr>
         <w:t>"Stop."</w:t>
       </w:r>
@@ -308,22 +339,9 @@
         <w:rPr>
           <w:b w:val="0"/>
           <w:i w:val="0"/>
+          <w:strike w:val="0"/>
         </w:rPr>
-        <w:t xml:space="preserve">He'd promised her, outside the four doors: </w:t>
-      </w:r>
-      <w:r>
-        <w:rPr>
-          <w:b w:val="0"/>
-          <w:i/>
-        </w:rPr>
-        <w:t>if I tell you to stop, you stop.</w:t>
-      </w:r>
-      <w:r>
-        <w:rPr>
-          <w:b w:val="0"/>
-          <w:i w:val="0"/>
-        </w:rPr>
-        <w:t xml:space="preserve"> He'd kept it once already, with a shock still humming in his bones. His hand opened, one finger at a time, as if each one had to be argued with separately. He stepped back. Not far.</w:t>
+        <w:t>He'd promised her that, outside the four doors. He'd kept it once already, with the shock still in his bones. His hand opened, one finger at a time, as if each one had to be argued with separately. He stepped back. Not far.</w:t>
       </w:r>
     </w:p>
     <w:p>
@@ -331,6 +349,7 @@
         <w:rPr>
           <w:b w:val="0"/>
           <w:i w:val="0"/>
+          <w:strike w:val="0"/>
         </w:rPr>
         <w:t>Flitzberg didn't rub his throat. He left the marks where they could see them.</w:t>
       </w:r>
@@ -340,6 +359,7 @@
         <w:rPr>
           <w:b w:val="0"/>
           <w:i w:val="0"/>
+          <w:strike w:val="0"/>
         </w:rPr>
         <w:t>"Then answer," Gage said. "Why? What did we ever do to you?"</w:t>
       </w:r>
@@ -349,6 +369,7 @@
         <w:rPr>
           <w:b w:val="0"/>
           <w:i w:val="0"/>
+          <w:strike w:val="0"/>
         </w:rPr>
         <w:t>"Nothing." Flitzberg's voice came out scraped. "You were not —" He stopped, and swallowed, and it cost him. "You were not punished. You were chosen. I know those look the same from where you stand. Your sister needs more than a spray can. Then you can hate me properly."</w:t>
       </w:r>
@@ -358,6 +379,7 @@
         <w:rPr>
           <w:b w:val="0"/>
           <w:i w:val="0"/>
+          <w:strike w:val="0"/>
         </w:rPr>
         <w:t>He raised one hand where they could all see it and beckoned at the glass.</w:t>
       </w:r>
@@ -367,6 +389,7 @@
         <w:rPr>
           <w:b w:val="0"/>
           <w:i w:val="0"/>
+          <w:strike w:val="0"/>
         </w:rPr>
         <w:t>Three people came in fast, two with a wheeled stretcher, one with cases, sleeves pushed up. Ben was between them and Camilla before the door finished opening, the can held up like a weapon.</w:t>
       </w:r>
@@ -376,6 +399,7 @@
         <w:rPr>
           <w:b w:val="0"/>
           <w:i w:val="0"/>
+          <w:strike w:val="0"/>
         </w:rPr>
         <w:t>The oldest of them, a woman with grey at her temples and hands scrubbed pink, stopped dead. She set her case on the floor, opened it and turned it so Ben could see inside.</w:t>
       </w:r>
@@ -385,6 +409,7 @@
         <w:rPr>
           <w:b w:val="0"/>
           <w:i w:val="0"/>
+          <w:strike w:val="0"/>
         </w:rPr>
         <w:t>"Clean sealant. Blood. Pain control that won't fog her." She didn't move toward Camilla. "You can walk next to the stretcher with your hand on her the whole way. Nobody's going to make you let go."</w:t>
       </w:r>
@@ -394,6 +419,7 @@
         <w:rPr>
           <w:b w:val="0"/>
           <w:i w:val="0"/>
+          <w:strike w:val="0"/>
         </w:rPr>
         <w:t>Ben looked at Gage. Gage looked at the case. Camilla looked too: sealed instruments in fitted foam, every one of them bright. Nothing she'd ever owned had been bright.</w:t>
       </w:r>
@@ -403,6 +429,7 @@
         <w:rPr>
           <w:b w:val="0"/>
           <w:i w:val="0"/>
+          <w:strike w:val="0"/>
         </w:rPr>
         <w:t>Gage nodded.</w:t>
       </w:r>
@@ -412,6 +439,7 @@
         <w:rPr>
           <w:b w:val="0"/>
           <w:i w:val="0"/>
+          <w:strike w:val="0"/>
         </w:rPr>
         <w:t>The two with the stretcher bent to her.</w:t>
       </w:r>
@@ -421,6 +449,7 @@
         <w:rPr>
           <w:b w:val="0"/>
           <w:i w:val="0"/>
+          <w:strike w:val="0"/>
         </w:rPr>
         <w:t>"No," Camilla said. "Him first." She couldn't lift the arm she wanted to lift, so she lifted the other one, two inches off the floor, and let it fall toward Otto. "Him. Then me."</w:t>
       </w:r>
@@ -430,6 +459,7 @@
         <w:rPr>
           <w:b w:val="0"/>
           <w:i w:val="0"/>
+          <w:strike w:val="0"/>
         </w:rPr>
         <w:t>The medic looked at the boy standing in the middle of the room breathing like a sleeper. She said one word to the third medic, who took a light and a grey instrument to Otto.</w:t>
       </w:r>
@@ -439,6 +469,7 @@
         <w:rPr>
           <w:b w:val="0"/>
           <w:i w:val="0"/>
+          <w:strike w:val="0"/>
         </w:rPr>
         <w:t>"Then we do you here," she told Camilla, and knelt. "Hold still."</w:t>
       </w:r>
@@ -448,6 +479,7 @@
         <w:rPr>
           <w:b w:val="0"/>
           <w:i w:val="0"/>
+          <w:strike w:val="0"/>
         </w:rPr>
         <w:t>"I've had practice."</w:t>
       </w:r>
@@ -457,6 +489,7 @@
         <w:rPr>
           <w:b w:val="0"/>
           <w:i w:val="0"/>
+          <w:strike w:val="0"/>
         </w:rPr>
         <w:t>The new sealant went on over Ben's, colder and deeper, and under it came the first warmth her shoulder had given her since the drone. A line went into the back of her right hand. The clear bag above her started to empty. For a while nothing changed, and then everything did: the room's edges came back sharp.</w:t>
       </w:r>
@@ -466,6 +499,7 @@
         <w:rPr>
           <w:b w:val="0"/>
           <w:i w:val="0"/>
+          <w:strike w:val="0"/>
         </w:rPr>
         <w:t>Across the room, the third medic shone the light in Otto's eyes. Left, right. His pupils did what pupils do. His face did nothing. The instrument went to his neck, his wrist, his chest. The medic looked at Flitzberg and didn't need to say anything.</w:t>
       </w:r>
@@ -475,6 +509,7 @@
         <w:rPr>
           <w:b w:val="0"/>
           <w:i w:val="0"/>
+          <w:strike w:val="0"/>
         </w:rPr>
         <w:t>"What's wrong with him?" Ben's voice cracked. "He's right there. He's breathing. Why won't he come back?"</w:t>
       </w:r>
@@ -484,8 +519,9 @@
         <w:rPr>
           <w:b w:val="0"/>
           <w:i w:val="0"/>
+          <w:strike w:val="0"/>
         </w:rPr>
-        <w:t>Flitzberg looked past him at Otto, the boy who'd held ten stones open over a lake of fire.</w:t>
+        <w:t>Flitzberg looked past him at Otto, the boy who'd held ten stones open over a lake of fire so the rest of them could drop through, and had stayed behind to do it.</w:t>
       </w:r>
     </w:p>
     <w:p>
@@ -493,6 +529,7 @@
         <w:rPr>
           <w:b w:val="0"/>
           <w:i w:val="0"/>
+          <w:strike w:val="0"/>
         </w:rPr>
         <w:t>"I do not know."</w:t>
       </w:r>
@@ -502,6 +539,7 @@
         <w:rPr>
           <w:b w:val="0"/>
           <w:i w:val="0"/>
+          <w:strike w:val="0"/>
         </w:rPr>
         <w:t>"You did this."</w:t>
       </w:r>
@@ -511,8 +549,9 @@
         <w:rPr>
           <w:b w:val="0"/>
           <w:i w:val="0"/>
+          <w:strike w:val="0"/>
         </w:rPr>
-        <w:t>"Yes. And I do not know." He let that sit. "Our instruments say he is well. Heart, breath, all of it. The instruments are wrong. Some part of him spent itself in that room, and it has not come back. We will keep his body strong and his door open. I will not pretend to more than that. You have been lied to with confidence your whole lives."</w:t>
+        <w:t>"Yes. And I do not know." He let that sit. "Our instruments say he is well. Heart, breath, all of it. The instruments are wrong. Some part of him spent itself in that room, and it has not come back. We will keep his body strong and his door open. I will not pretend to more than that."</w:t>
       </w:r>
     </w:p>
     <w:p>
@@ -520,6 +559,7 @@
         <w:rPr>
           <w:b w:val="0"/>
           <w:i w:val="0"/>
+          <w:strike w:val="0"/>
         </w:rPr>
         <w:t>"That's not good enough," Gage said.</w:t>
       </w:r>
@@ -529,6 +569,7 @@
         <w:rPr>
           <w:b w:val="0"/>
           <w:i w:val="0"/>
+          <w:strike w:val="0"/>
         </w:rPr>
         <w:t>"It is what there is."</w:t>
       </w:r>
@@ -538,6 +579,7 @@
         <w:rPr>
           <w:b w:val="0"/>
           <w:i w:val="0"/>
+          <w:strike w:val="0"/>
         </w:rPr>
         <w:t>Gage took a step toward him. Flitzberg didn't take one back.</w:t>
       </w:r>
@@ -547,6 +589,7 @@
         <w:rPr>
           <w:b w:val="0"/>
           <w:i w:val="0"/>
+          <w:strike w:val="0"/>
         </w:rPr>
         <w:t>"The guard at the doors," Gage said. "'Pass all four, you live. Fail—' He didn't finish. You finish it."</w:t>
       </w:r>
@@ -556,6 +599,7 @@
         <w:rPr>
           <w:b w:val="0"/>
           <w:i w:val="0"/>
+          <w:strike w:val="0"/>
         </w:rPr>
         <w:t>"Some who fail die." Flitzberg didn't soften it. "Not by our hand. But the rooms are not theater. That drone was not pretending. When a team breaks in there, the rooms do not get gentler."</w:t>
       </w:r>
@@ -565,6 +609,7 @@
         <w:rPr>
           <w:b w:val="0"/>
           <w:i w:val="0"/>
+          <w:strike w:val="0"/>
         </w:rPr>
         <w:t>"And Camilla's arm?" Ben was crying now and not hiding it. "And Otto? That was the price?"</w:t>
       </w:r>
@@ -574,6 +619,7 @@
         <w:rPr>
           <w:b w:val="0"/>
           <w:i w:val="0"/>
+          <w:strike w:val="0"/>
         </w:rPr>
         <w:t>"Yes."</w:t>
       </w:r>
@@ -583,6 +629,7 @@
         <w:rPr>
           <w:b w:val="0"/>
           <w:i w:val="0"/>
+          <w:strike w:val="0"/>
         </w:rPr>
         <w:t>The medic's hands kept working. The bag kept emptying.</w:t>
       </w:r>
@@ -592,6 +639,7 @@
         <w:rPr>
           <w:b w:val="0"/>
           <w:i w:val="0"/>
+          <w:strike w:val="0"/>
         </w:rPr>
         <w:t>"Your sister paid it on her feet," Flitzberg said. "Remember that, before anything else about tonight."</w:t>
       </w:r>
@@ -601,6 +649,7 @@
         <w:rPr>
           <w:b w:val="0"/>
           <w:i w:val="0"/>
+          <w:strike w:val="0"/>
         </w:rPr>
         <w:t>"Don't," Camilla said.</w:t>
       </w:r>
@@ -610,6 +659,7 @@
         <w:rPr>
           <w:b w:val="0"/>
           <w:i w:val="0"/>
+          <w:strike w:val="0"/>
         </w:rPr>
         <w:t>He looked down at her.</w:t>
       </w:r>
@@ -619,6 +669,7 @@
         <w:rPr>
           <w:b w:val="0"/>
           <w:i w:val="0"/>
+          <w:strike w:val="0"/>
         </w:rPr>
         <w:t>"Don't make it a story." Her voice shook and she let it. "I didn't meet anything. I counted. Somebody had to count."</w:t>
       </w:r>
@@ -628,6 +679,7 @@
         <w:rPr>
           <w:b w:val="0"/>
           <w:i w:val="0"/>
+          <w:strike w:val="0"/>
         </w:rPr>
         <w:t>"And somebody had to pay," Flitzberg said. "Both of those are true. I will not take either one back to make this easier for you."</w:t>
       </w:r>
@@ -637,6 +689,7 @@
         <w:rPr>
           <w:b w:val="0"/>
           <w:i w:val="0"/>
+          <w:strike w:val="0"/>
         </w:rPr>
         <w:t>Nobody had ever told her no and meant it kindly. She didn't know what to do with her face.</w:t>
       </w:r>
@@ -646,6 +699,7 @@
         <w:rPr>
           <w:b w:val="0"/>
           <w:i w:val="0"/>
+          <w:strike w:val="0"/>
         </w:rPr>
         <w:t>Gage turned to the door they'd come in by. "We're going home."</w:t>
       </w:r>
@@ -655,6 +709,7 @@
         <w:rPr>
           <w:b w:val="0"/>
           <w:i w:val="0"/>
+          <w:strike w:val="0"/>
         </w:rPr>
         <w:t>"Not tonight."</w:t>
       </w:r>
@@ -664,6 +719,7 @@
         <w:rPr>
           <w:b w:val="0"/>
           <w:i w:val="0"/>
+          <w:strike w:val="0"/>
         </w:rPr>
         <w:t>"You don't get to say—"</w:t>
       </w:r>
@@ -673,13 +729,15 @@
         <w:rPr>
           <w:b w:val="0"/>
           <w:i w:val="0"/>
+          <w:strike w:val="0"/>
         </w:rPr>
-        <w:t xml:space="preserve">"In four days," Flitzberg said, and his voice gave out on him again, and he made it work, "the mine will write one word next to your three names. </w:t>
+        <w:t xml:space="preserve">"In four days," Flitzberg said, and his voice gave out on him again, and he made it work, "the mine writes one word next to your three names. </w:t>
       </w:r>
       <w:r>
         <w:rPr>
           <w:b w:val="0"/>
           <w:i/>
+          <w:strike w:val="0"/>
         </w:rPr>
         <w:t>Absconded.</w:t>
       </w:r>
@@ -687,8 +745,9 @@
         <w:rPr>
           <w:b w:val="0"/>
           <w:i w:val="0"/>
+          <w:strike w:val="0"/>
         </w:rPr>
-        <w:t xml:space="preserve"> Your slots go back in the pool. Camilla's ration card stops being drawn the same morning, and nobody asks why. Miner Town does not go looking for children who walk away. It goes looking for the ones who come back." He swallowed. "Walk out of here tonight, bleeding, with no story, and you are the trouble the city bills your street for. Rations short. Quotas up. Somebody's door kicked in who had nothing to do with you."</w:t>
+        <w:t xml:space="preserve"> It is the kindest word it has. Nobody bills a street for a boy who ran. Your slots go back in the pool, Camilla's ration card is not drawn again, and nobody asks why. Miner Town does not go looking for children who walk away." He swallowed. "Before then, you choose. Stay, or go home with a story I give you, one that holds. Walk out of here tonight, bleeding, with no story, and you are the trouble the city bills your street for. Rations short. Quotas up. Somebody's door kicked in who had nothing to do with you."</w:t>
       </w:r>
     </w:p>
     <w:p>
@@ -696,6 +755,7 @@
         <w:rPr>
           <w:b w:val="0"/>
           <w:i w:val="0"/>
+          <w:strike w:val="0"/>
         </w:rPr>
         <w:t>Ben's head came up. "Gretchen's at the gates. She'll be there tomorrow. She'll be there every day."</w:t>
       </w:r>
@@ -705,6 +765,7 @@
         <w:rPr>
           <w:b w:val="0"/>
           <w:i w:val="0"/>
+          <w:strike w:val="0"/>
         </w:rPr>
         <w:t>"I know."</w:t>
       </w:r>
@@ -714,6 +775,7 @@
         <w:rPr>
           <w:b w:val="0"/>
           <w:i w:val="0"/>
+          <w:strike w:val="0"/>
         </w:rPr>
         <w:t>"Then tell her."</w:t>
       </w:r>
@@ -723,6 +785,7 @@
         <w:rPr>
           <w:b w:val="0"/>
           <w:i w:val="0"/>
+          <w:strike w:val="0"/>
         </w:rPr>
         <w:t>"I cannot send word up. Nothing goes up that the ground could read." Flitzberg looked away from them, at the glass. He hadn't done that yet. "I am sorry. That is not a thing I can fix tonight."</w:t>
       </w:r>
@@ -732,6 +795,27 @@
         <w:rPr>
           <w:b w:val="0"/>
           <w:i w:val="0"/>
+          <w:strike w:val="0"/>
+        </w:rPr>
+        <w:t>Ben laughed, once, wet and ugly. "So she stands there four days, and then they write it down, and she stands there anyway." He wiped his face with his wrist. "There's no counter in Miner Town where you line up and ask for your freedom back."</w:t>
+      </w:r>
+    </w:p>
+    <w:p>
+      <w:r>
+        <w:rPr>
+          <w:b w:val="0"/>
+          <w:i w:val="0"/>
+          <w:strike w:val="0"/>
+        </w:rPr>
+        <w:t>"No," Flitzberg said. "There is not."</w:t>
+      </w:r>
+    </w:p>
+    <w:p>
+      <w:r>
+        <w:rPr>
+          <w:b w:val="0"/>
+          <w:i w:val="0"/>
+          <w:strike w:val="0"/>
         </w:rPr>
         <w:t>Gage's hands had closed. Camilla watched them close.</w:t>
       </w:r>
@@ -741,42 +825,7 @@
         <w:rPr>
           <w:b w:val="0"/>
           <w:i w:val="0"/>
-        </w:rPr>
-        <w:t>"And this birthright," he said. "Say what it means or I'm walking."</w:t>
-      </w:r>
-    </w:p>
-    <w:p>
-      <w:r>
-        <w:rPr>
-          <w:b w:val="0"/>
-          <w:i w:val="0"/>
-        </w:rPr>
-        <w:t>"It means there are papers." Flitzberg kept it short; he had to. "Old ones, signed. Your families could once move, sell what they dug, choose who set the quotas. Nobody stole that in the night. It was signed away, one rule at a time. Signatures leave records."</w:t>
-      </w:r>
-    </w:p>
-    <w:p>
-      <w:r>
-        <w:rPr>
-          <w:b w:val="0"/>
-          <w:i w:val="0"/>
-        </w:rPr>
-        <w:t>Ben laughed, once, wet and ugly. "So there's a piece of paper. Great. Who do we show it to? The guards?" He wiped his face with his wrist. "There's no counter in Miner Town where you line up and ask for your freedom back."</w:t>
-      </w:r>
-    </w:p>
-    <w:p>
-      <w:r>
-        <w:rPr>
-          <w:b w:val="0"/>
-          <w:i w:val="0"/>
-        </w:rPr>
-        <w:t>"No," Flitzberg said. "There is not. Which is why the rest of it is long."</w:t>
-      </w:r>
-    </w:p>
-    <w:p>
-      <w:r>
-        <w:rPr>
-          <w:b w:val="0"/>
-          <w:i w:val="0"/>
+          <w:strike w:val="0"/>
         </w:rPr>
         <w:t>Gage opened his mouth.</w:t>
       </w:r>
@@ -786,6 +835,7 @@
         <w:rPr>
           <w:b w:val="0"/>
           <w:i w:val="0"/>
+          <w:strike w:val="0"/>
         </w:rPr>
         <w:t>"Gage." Camilla got her good elbow under herself. It took two tries. "Look at Otto. Look at Ben."</w:t>
       </w:r>
@@ -795,6 +845,7 @@
         <w:rPr>
           <w:b w:val="0"/>
           <w:i w:val="0"/>
+          <w:strike w:val="0"/>
         </w:rPr>
         <w:t>Ben was swaying where he knelt. He put a hand down on the floor to stop it.</w:t>
       </w:r>
@@ -804,6 +855,7 @@
         <w:rPr>
           <w:b w:val="0"/>
           <w:i w:val="0"/>
+          <w:strike w:val="0"/>
         </w:rPr>
         <w:t>"We stay," she said. "Tonight. He talks tomorrow, all of it. And if he doesn't, we walk, and you can carry me."</w:t>
       </w:r>
@@ -813,6 +865,7 @@
         <w:rPr>
           <w:b w:val="0"/>
           <w:i w:val="0"/>
+          <w:strike w:val="0"/>
         </w:rPr>
         <w:t>Gage looked at her for a long time. Then his hands came open, slowly, the way they had at the man's throat.</w:t>
       </w:r>
@@ -822,6 +875,7 @@
         <w:rPr>
           <w:b w:val="0"/>
           <w:i w:val="0"/>
+          <w:strike w:val="0"/>
         </w:rPr>
         <w:t>"Tomorrow," he said to Flitzberg. "All of it."</w:t>
       </w:r>
@@ -831,8 +885,9 @@
         <w:rPr>
           <w:b w:val="0"/>
           <w:i w:val="0"/>
+          <w:strike w:val="0"/>
         </w:rPr>
-        <w:t>"All of it," Flitzberg said. "You have my word, which you have no reason yet to value."</w:t>
+        <w:t>"All of it," Flitzberg said. "Then you choose. You have my word."</w:t>
       </w:r>
     </w:p>
     <w:p>
@@ -840,6 +895,7 @@
         <w:rPr>
           <w:b w:val="0"/>
           <w:i w:val="0"/>
+          <w:strike w:val="0"/>
         </w:rPr>
         <w:t>The medic taped the line flat against Camilla's hand. "That stays in. You'll be stronger by morning, and you'll hate the tape. Both are fine." She nodded to the others. "Now."</w:t>
       </w:r>
@@ -849,8 +905,9 @@
         <w:rPr>
           <w:b w:val="0"/>
           <w:i w:val="0"/>
+          <w:strike w:val="0"/>
         </w:rPr>
-        <w:t>They lifted her: four hands under her, nothing jarred, nothing left to find its own way. Nobody in Miner Town had ever lifted a miner's body like that. Ben came with her, his hand on her good shoulder, exactly as he'd been told he could.</w:t>
+        <w:t>They lifted her: four hands under her, nothing jarred, nothing left to find its own way. She'd never been lifted. In Miner Town you got dragged. Ben came with her, his hand on her good shoulder, exactly as he'd been told he could.</w:t>
       </w:r>
     </w:p>
     <w:p>
@@ -858,6 +915,7 @@
         <w:rPr>
           <w:b w:val="0"/>
           <w:i w:val="0"/>
+          <w:strike w:val="0"/>
         </w:rPr>
         <w:t>Flitzberg went to the inner doors. They opened on a corridor, and the lights woke one at a time ahead of them, each a step beyond the last.</w:t>
       </w:r>
@@ -867,6 +925,7 @@
         <w:rPr>
           <w:b w:val="0"/>
           <w:i w:val="0"/>
+          <w:strike w:val="0"/>
         </w:rPr>
         <w:t>"Eat," he said. "Sleep. Sit with your friend and talk to him. For all our instruments can tell, he hears every word."</w:t>
       </w:r>
@@ -876,6 +935,7 @@
         <w:rPr>
           <w:b w:val="0"/>
           <w:i w:val="0"/>
+          <w:strike w:val="0"/>
         </w:rPr>
         <w:t>From the stretcher, flat on her back, Camilla got the room one last time.</w:t>
       </w:r>
@@ -885,6 +945,7 @@
         <w:rPr>
           <w:b w:val="0"/>
           <w:i w:val="0"/>
+          <w:strike w:val="0"/>
         </w:rPr>
         <w:t>Gage went to Otto. He said Otto's name once and got nothing back. Then he bent, took Otto's arm across his shoulders, and lifted him, and Camilla had the strangest feeling of the world folding over on itself. She'd seen this before: outside the mine gates on the fourth morning, Gage walking up out of the dark with Otto across his shoulders and Ben by the collar, while the guards waited for a broken boy who never came.</w:t>
       </w:r>
@@ -894,6 +955,7 @@
         <w:rPr>
           <w:b w:val="0"/>
           <w:i w:val="0"/>
+          <w:strike w:val="0"/>
         </w:rPr>
         <w:t>He was carrying Otto out again. This time Otto didn't know it.</w:t>
       </w:r>
@@ -903,6 +965,7 @@
         <w:rPr>
           <w:b w:val="0"/>
           <w:i w:val="0"/>
+          <w:strike w:val="0"/>
         </w:rPr>
         <w:t>She counted them through the door. Gage, with Otto on his back. Ben, beside her. Herself.</w:t>
       </w:r>
@@ -912,6 +975,7 @@
         <w:rPr>
           <w:b w:val="0"/>
           <w:i w:val="0"/>
+          <w:strike w:val="0"/>
         </w:rPr>
         <w:t>Four of them. Three awake.</w:t>
       </w:r>
@@ -921,6 +985,7 @@
         <w:rPr>
           <w:b w:val="0"/>
           <w:i w:val="0"/>
+          <w:strike w:val="0"/>
         </w:rPr>
         <w:t>She'd count again in the morning. She'd keep counting until it was four.</w:t>
       </w:r>
@@ -930,6 +995,7 @@
         <w:rPr>
           <w:b w:val="0"/>
           <w:i w:val="0"/>
+          <w:strike w:val="0"/>
         </w:rPr>
         <w:t>Then the corridor took her, and the lights woke ahead of the stretcher, running on into the dark faster than anyone could walk.</w:t>
       </w:r>

</xml_diff>

<commit_message>
Ch2 round 3: Gage starts to leave; Camilla stops him with Otto's truth
Structural beat: Gage lifts Camilla to go, the medic blocks him, Ben can't
stand to fetch Otto, and Camilla says what she's been avoiding ("You can
carry me... You can't carry him"), so "Tomorrow. All of it" is the
siblings' deal. Clarity: "months ago, at the end of the Initiation", "on the
shift roll", "Walk back through those gates tonight"; crystal read once,
unchanged, before the count. Cut three flagged phrases. Opus/Fable drafts,
Fable base; blind reviews 8 vs 7 (Sonnet, Haiku). Regenerate the Word file.

Co-Authored-By: Claude Opus 5.5 <noreply@anthropic.com>
</commit_message>
<xml_diff>
--- a/claude-notes/manuscript-v2/02-now-the-throat-merged.docx
+++ b/claude-notes/manuscript-v2/02-now-the-throat-merged.docx
@@ -281,7 +281,7 @@
           <w:i w:val="0"/>
           <w:strike w:val="0"/>
         </w:rPr>
-        <w:t>"You are angry at the right person," Flitzberg got out. He had to stop and swallow, and she watched it go down him like a stone. "The right person is also the only one who will answer you. That is why I came in alone."</w:t>
+        <w:t>"You are angry at the right person," Flitzberg got out. He had to stop and swallow, and she watched it go down him. "The right person is also the only one who will answer you. That is why I came in alone."</w:t>
       </w:r>
     </w:p>
     <w:p>
@@ -691,7 +691,7 @@
           <w:i w:val="0"/>
           <w:strike w:val="0"/>
         </w:rPr>
-        <w:t>Nobody had ever told her no and meant it kindly. She didn't know what to do with her face.</w:t>
+        <w:t>She didn't know what to do with her face.</w:t>
       </w:r>
     </w:p>
     <w:p>
@@ -731,7 +731,7 @@
           <w:i w:val="0"/>
           <w:strike w:val="0"/>
         </w:rPr>
-        <w:t xml:space="preserve">"In four days," Flitzberg said, and his voice gave out on him again, and he made it work, "the mine writes one word next to your three names. </w:t>
+        <w:t xml:space="preserve">"In four days," Flitzberg said, and his voice gave out on him again, and he made it work, "the mine writes one word next to your three names on the shift roll. </w:t>
       </w:r>
       <w:r>
         <w:rPr>
@@ -747,7 +747,7 @@
           <w:i w:val="0"/>
           <w:strike w:val="0"/>
         </w:rPr>
-        <w:t xml:space="preserve"> It is the kindest word it has. Nobody bills a street for a boy who ran. Your slots go back in the pool, Camilla's ration card is not drawn again, and nobody asks why. Miner Town does not go looking for children who walk away." He swallowed. "Before then, you choose. Stay, or go home with a story I give you, one that holds. Walk out of here tonight, bleeding, with no story, and you are the trouble the city bills your street for. Rations short. Quotas up. Somebody's door kicked in who had nothing to do with you."</w:t>
+        <w:t xml:space="preserve"> It is the kindest word it has. Nobody bills a street for a boy who ran. Your slots go back in the pool, Camilla's ration card is not drawn again, and nobody asks why. Miner Town does not go looking for children who walk away." He swallowed. "Before then, you choose. Stay, or go home with a story I give you, one that holds. Walk back through those gates tonight, bleeding, with no story, and you are the trouble the city bills your street for. Rations short. Quotas up. Somebody's door kicked in who had nothing to do with you."</w:t>
       </w:r>
     </w:p>
     <w:p>
@@ -827,7 +827,7 @@
           <w:i w:val="0"/>
           <w:strike w:val="0"/>
         </w:rPr>
-        <w:t>Gage opened his mouth.</w:t>
+        <w:t>Then he turned his back on Flitzberg and came to her, and went down on one knee beside the medic, and got an arm under her shoulders. His other hand went under her knees. He was careful of the sealant. He was careful of nothing else.</w:t>
       </w:r>
     </w:p>
     <w:p>
@@ -837,7 +837,7 @@
           <w:i w:val="0"/>
           <w:strike w:val="0"/>
         </w:rPr>
-        <w:t>"Gage." Camilla got her good elbow under herself. It took two tries. "Look at Otto. Look at Ben."</w:t>
+        <w:t>"Hey." The medic's hand came down flat on his forearm. "She's got a line in. You lift her now and that shoulder opens before you're out of this room."</w:t>
       </w:r>
     </w:p>
     <w:p>
@@ -847,7 +847,7 @@
           <w:i w:val="0"/>
           <w:strike w:val="0"/>
         </w:rPr>
-        <w:t>Ben was swaying where he knelt. He put a hand down on the floor to stop it.</w:t>
+        <w:t>"Then pull it."</w:t>
       </w:r>
     </w:p>
     <w:p>
@@ -857,7 +857,7 @@
           <w:i w:val="0"/>
           <w:strike w:val="0"/>
         </w:rPr>
-        <w:t>"We stay," she said. "Tonight. He talks tomorrow, all of it. And if he doesn't, we walk, and you can carry me."</w:t>
+        <w:t>"I'm not pulling it."</w:t>
       </w:r>
     </w:p>
     <w:p>
@@ -867,7 +867,97 @@
           <w:i w:val="0"/>
           <w:strike w:val="0"/>
         </w:rPr>
-        <w:t>Gage looked at her for a long time. Then his hands came open, slowly, the way they had at the man's throat.</w:t>
+        <w:t>"Ben." Gage didn't look up. "Get Otto."</w:t>
+      </w:r>
+    </w:p>
+    <w:p>
+      <w:r>
+        <w:rPr>
+          <w:b w:val="0"/>
+          <w:i w:val="0"/>
+          <w:strike w:val="0"/>
+        </w:rPr>
+        <w:t>Ben tried to stand. He got one foot under himself and swayed, and put a hand down on the floor to stop it, and stayed there.</w:t>
+      </w:r>
+    </w:p>
+    <w:p>
+      <w:r>
+        <w:rPr>
+          <w:b w:val="0"/>
+          <w:i w:val="0"/>
+          <w:strike w:val="0"/>
+        </w:rPr>
+        <w:t>"Gage." Camilla's head was against his chest. She could feel him breathing, too fast, end-of-shift fast. "Look at Ben. He can't get up. Who's carrying Otto?"</w:t>
+      </w:r>
+    </w:p>
+    <w:p>
+      <w:r>
+        <w:rPr>
+          <w:b w:val="0"/>
+          <w:i w:val="0"/>
+          <w:strike w:val="0"/>
+        </w:rPr>
+        <w:t>"I'll come back for him."</w:t>
+      </w:r>
+    </w:p>
+    <w:p>
+      <w:r>
+        <w:rPr>
+          <w:b w:val="0"/>
+          <w:i w:val="0"/>
+          <w:strike w:val="0"/>
+        </w:rPr>
+        <w:t>"All the way up, and through the gates, and back down. With me on you, and him at the top with nobody." She made herself say the rest. "Gage. I counted him. I've been counting all of you since I opened my eyes, and every time I get to him I get nothing back. He's breathing and he isn't there, and I've been lying here not saying it because you'd hear it. If we carry him home, nobody up there can keep him breathing. Rita can't. I can't. He stays where the machines are, or he dies in a shack with his eyes open, and I'll be the one who counted that."</w:t>
+      </w:r>
+    </w:p>
+    <w:p>
+      <w:r>
+        <w:rPr>
+          <w:b w:val="0"/>
+          <w:i w:val="0"/>
+          <w:strike w:val="0"/>
+        </w:rPr>
+        <w:t>Gage had stopped moving. She felt the stop go through him.</w:t>
+      </w:r>
+    </w:p>
+    <w:p>
+      <w:r>
+        <w:rPr>
+          <w:b w:val="0"/>
+          <w:i w:val="0"/>
+          <w:strike w:val="0"/>
+        </w:rPr>
+        <w:t>"You can carry me," she said. "You're already doing it. You can't carry him."</w:t>
+      </w:r>
+    </w:p>
+    <w:p>
+      <w:r>
+        <w:rPr>
+          <w:b w:val="0"/>
+          <w:i w:val="0"/>
+          <w:strike w:val="0"/>
+        </w:rPr>
+        <w:t>Ben made a sound on the floor. Flitzberg stood where he was and said nothing, and his hands stayed at his sides.</w:t>
+      </w:r>
+    </w:p>
+    <w:p>
+      <w:r>
+        <w:rPr>
+          <w:b w:val="0"/>
+          <w:i w:val="0"/>
+          <w:strike w:val="0"/>
+        </w:rPr>
+        <w:t>"We stay," she said. "Tonight. He talks tomorrow, all of it. And if he doesn't, we walk."</w:t>
+      </w:r>
+    </w:p>
+    <w:p>
+      <w:r>
+        <w:rPr>
+          <w:b w:val="0"/>
+          <w:i w:val="0"/>
+          <w:strike w:val="0"/>
+        </w:rPr>
+        <w:t>Gage looked at her for a long time. Then he laid her back down on the floor, and his hands came open, slowly, and he stayed on his knee beside her.</w:t>
       </w:r>
     </w:p>
     <w:p>
@@ -897,7 +987,7 @@
           <w:i w:val="0"/>
           <w:strike w:val="0"/>
         </w:rPr>
-        <w:t>The medic taped the line flat against Camilla's hand. "That stays in. You'll be stronger by morning, and you'll hate the tape. Both are fine." She nodded to the others. "Now."</w:t>
+        <w:t>The medic let out her breath, and checked the line, and taped it flat against Camilla's hand. "That stays in. You'll be stronger by morning, and you'll hate the tape. Both are fine." She nodded to the others. "Now."</w:t>
       </w:r>
     </w:p>
     <w:p>
@@ -947,7 +1037,7 @@
           <w:i w:val="0"/>
           <w:strike w:val="0"/>
         </w:rPr>
-        <w:t>Gage went to Otto. He said Otto's name once and got nothing back. Then he bent, took Otto's arm across his shoulders, and lifted him, and Camilla had the strangest feeling of the world folding over on itself. She'd seen this before: outside the mine gates on the fourth morning, Gage walking up out of the dark with Otto across his shoulders and Ben by the collar, while the guards waited for a broken boy who never came.</w:t>
+        <w:t>Gage went to Otto. He said Otto's name once and got nothing back. Then he bent, took Otto's arm across his shoulders, and lifted him, and Camilla had the strangest feeling of the world folding over on itself. She'd seen this before: months ago, at the end of the Initiation, outside the mine gates on the fourth morning, Gage walking up out of the dark with Otto across his shoulders and Ben by the collar, while the guards waited for a broken boy who never came.</w:t>
       </w:r>
     </w:p>
     <w:p>
@@ -958,6 +1048,16 @@
           <w:strike w:val="0"/>
         </w:rPr>
         <w:t>He was carrying Otto out again. This time Otto didn't know it.</w:t>
+      </w:r>
+    </w:p>
+    <w:p>
+      <w:r>
+        <w:rPr>
+          <w:b w:val="0"/>
+          <w:i w:val="0"/>
+          <w:strike w:val="0"/>
+        </w:rPr>
+        <w:t>Behind the empty place where Otto had stood, the crystal. Still a quarter blue.</w:t>
       </w:r>
     </w:p>
     <w:p>

</xml_diff>

<commit_message>
Ch2 round 4: Flitzberg answers with UNASSIGNED ("I decided")
Flitzberg's answer to "What did we ever do to you?" now ties to Ch1: "At
your Initiation the city could not decide whose you were. Three names, no
house... I watched it fail to decide, and I decided." He observed, didn't
cause it; Ch6's father's-slot reveal untouched. The medics' delay gets a
reason; "She paid it on her feet" to Gage; "I didn't stand up to anything";
"He didn't see the line"; trim Camilla's speech; "Ma can't". Opus/Fable
combined; blind reviews 8.5 vs 7.5 (Sonnet), 8 vs 7 (Haiku).

Co-Authored-By: Claude Opus 5.5 <noreply@anthropic.com>
</commit_message>
<xml_diff>
--- a/claude-notes/manuscript-v2/02-now-the-throat-merged.docx
+++ b/claude-notes/manuscript-v2/02-now-the-throat-merged.docx
@@ -371,7 +371,7 @@
           <w:i w:val="0"/>
           <w:strike w:val="0"/>
         </w:rPr>
-        <w:t>"Nothing." Flitzberg's voice came out scraped. "You were not —" He stopped, and swallowed, and it cost him. "You were not punished. You were chosen. I know those look the same from where you stand. Your sister needs more than a spray can. Then you can hate me properly."</w:t>
+        <w:t>"Nothing." Flitzberg's voice came out scraped. "You were not —" He stopped, and swallowed, and it cost him. "You were not punished. You were chosen. I know those look the same from where you stand." He swallowed again, and waited for his voice. "At your Initiation the city could not decide whose you were. Three names, no house. No one answerable for whether you came back up. I watched it fail to decide, and I decided." His eyes went to Camilla on the floor. "The rest tomorrow. Your sister needs more than a spray can. Then you can hate me properly."</w:t>
       </w:r>
     </w:p>
     <w:p>
@@ -381,7 +381,7 @@
           <w:i w:val="0"/>
           <w:strike w:val="0"/>
         </w:rPr>
-        <w:t>He raised one hand where they could all see it and beckoned at the glass.</w:t>
+        <w:t>He raised one hand where they could all see it and beckoned at the glass. "If a stranger had reached her before I did, you would have broken him. So they waited, and I came first."</w:t>
       </w:r>
     </w:p>
     <w:p>
@@ -641,7 +641,7 @@
           <w:i w:val="0"/>
           <w:strike w:val="0"/>
         </w:rPr>
-        <w:t>"Your sister paid it on her feet," Flitzberg said. "Remember that, before anything else about tonight."</w:t>
+        <w:t>"She paid it on her feet," Flitzberg said to Gage. "Remember that, before anything else about tonight."</w:t>
       </w:r>
     </w:p>
     <w:p>
@@ -671,7 +671,7 @@
           <w:i w:val="0"/>
           <w:strike w:val="0"/>
         </w:rPr>
-        <w:t>"Don't make it a story." Her voice shook and she let it. "I didn't meet anything. I counted. Somebody had to count."</w:t>
+        <w:t>"Don't make it a story." Her voice shook and she let it. "I didn't stand up to anything. I counted. Somebody had to count."</w:t>
       </w:r>
     </w:p>
     <w:p>
@@ -827,7 +827,7 @@
           <w:i w:val="0"/>
           <w:strike w:val="0"/>
         </w:rPr>
-        <w:t>Then he turned his back on Flitzberg and came to her, and went down on one knee beside the medic, and got an arm under her shoulders. His other hand went under her knees. He was careful of the sealant. He was careful of nothing else.</w:t>
+        <w:t>Then he turned his back on Flitzberg and came to her, and went down on one knee beside the medic, and got an arm under her shoulders. His other hand went under her knees. He was careful of the sealant. He didn't see the line in the back of her hand.</w:t>
       </w:r>
     </w:p>
     <w:p>
@@ -907,7 +907,7 @@
           <w:i w:val="0"/>
           <w:strike w:val="0"/>
         </w:rPr>
-        <w:t>"All the way up, and through the gates, and back down. With me on you, and him at the top with nobody." She made herself say the rest. "Gage. I counted him. I've been counting all of you since I opened my eyes, and every time I get to him I get nothing back. He's breathing and he isn't there, and I've been lying here not saying it because you'd hear it. If we carry him home, nobody up there can keep him breathing. Rita can't. I can't. He stays where the machines are, or he dies in a shack with his eyes open, and I'll be the one who counted that."</w:t>
+        <w:t>"All the way up, and through the gates, and back down. With me on you, and him at the top with nobody." She made herself say the rest. "Gage. I counted him. I've been counting all of you since I opened my eyes, and every time I get to him I get nothing back. He's breathing and he isn't there, and I've been lying here not saying it. If we carry him home, nobody up there can keep him breathing. Ma can't. I can't. He stays where the machines are, or he dies in a shack with his eyes open, and I'll be the one who counted that."</w:t>
       </w:r>
     </w:p>
     <w:p>

</xml_diff>

<commit_message>
Ch2 round 5: "I stop telling Gage to stop"; Otto can't eat, not breathe
Camilla's condition becomes a real threat tied to the epigraph. Cut "The
rest tomorrow." Otto's danger is eating and drinking, matching the medic's
readings; "You can't carry him home." Ben: "She'll think I ran." /
"She will. Until you tell her otherwise." Opus/Fable combined; blind
reviews 8.5 vs 7 (Sonnet), 8 vs 7.5 (Haiku). Regenerate the Word file.

Co-Authored-By: Claude Opus 5.5 <noreply@anthropic.com>
</commit_message>
<xml_diff>
--- a/claude-notes/manuscript-v2/02-now-the-throat-merged.docx
+++ b/claude-notes/manuscript-v2/02-now-the-throat-merged.docx
@@ -371,7 +371,7 @@
           <w:i w:val="0"/>
           <w:strike w:val="0"/>
         </w:rPr>
-        <w:t>"Nothing." Flitzberg's voice came out scraped. "You were not —" He stopped, and swallowed, and it cost him. "You were not punished. You were chosen. I know those look the same from where you stand." He swallowed again, and waited for his voice. "At your Initiation the city could not decide whose you were. Three names, no house. No one answerable for whether you came back up. I watched it fail to decide, and I decided." His eyes went to Camilla on the floor. "The rest tomorrow. Your sister needs more than a spray can. Then you can hate me properly."</w:t>
+        <w:t>"Nothing." Flitzberg's voice came out scraped. "You were not —" He stopped, and swallowed, and it cost him. "You were not punished. You were chosen. I know those look the same from where you stand." He swallowed again, and waited for his voice. "At your Initiation the city could not decide whose you were. Three names, no house. No one answerable for whether you came back up. I watched it fail to decide, and I decided." His eyes went to Camilla on the floor. "Your sister needs more than a spray can. Then you can hate me properly."</w:t>
       </w:r>
     </w:p>
     <w:p>
@@ -797,7 +797,7 @@
           <w:i w:val="0"/>
           <w:strike w:val="0"/>
         </w:rPr>
-        <w:t>Ben laughed, once, wet and ugly. "So she stands there four days, and then they write it down, and she stands there anyway." He wiped his face with his wrist. "There's no counter in Miner Town where you line up and ask for your freedom back."</w:t>
+        <w:t>Ben laughed, once, wet and ugly. "So she stands there four days, and then they write it down, and she stands there anyway." He wiped his face with his wrist. "She'll think I ran."</w:t>
       </w:r>
     </w:p>
     <w:p>
@@ -807,7 +807,7 @@
           <w:i w:val="0"/>
           <w:strike w:val="0"/>
         </w:rPr>
-        <w:t>"No," Flitzberg said. "There is not."</w:t>
+        <w:t>"She will," Flitzberg said. "Until you tell her otherwise."</w:t>
       </w:r>
     </w:p>
     <w:p>
@@ -907,7 +907,7 @@
           <w:i w:val="0"/>
           <w:strike w:val="0"/>
         </w:rPr>
-        <w:t>"All the way up, and through the gates, and back down. With me on you, and him at the top with nobody." She made herself say the rest. "Gage. I counted him. I've been counting all of you since I opened my eyes, and every time I get to him I get nothing back. He's breathing and he isn't there, and I've been lying here not saying it. If we carry him home, nobody up there can keep him breathing. Ma can't. I can't. He stays where the machines are, or he dies in a shack with his eyes open, and I'll be the one who counted that."</w:t>
+        <w:t>"All the way up, and through the gates, and back down. With me on you, and him at the top with nobody." She made herself say the rest. "Gage. I counted him. I've been counting all of you since I opened my eyes, and every time I get to him I get nothing back. He's breathing and he isn't there, and I've been lying here not saying it. He can't eat. He can't drink unless somebody makes him. If we carry him home, Ma can't do that for long. I can't. He stays where the machines are, or he dies in a shack with his eyes open, and I'll be the one who counted that."</w:t>
       </w:r>
     </w:p>
     <w:p>
@@ -927,7 +927,7 @@
           <w:i w:val="0"/>
           <w:strike w:val="0"/>
         </w:rPr>
-        <w:t>"You can carry me," she said. "You're already doing it. You can't carry him."</w:t>
+        <w:t>"You can carry me," she said. "You're already doing it. You can't carry him home."</w:t>
       </w:r>
     </w:p>
     <w:p>
@@ -947,7 +947,7 @@
           <w:i w:val="0"/>
           <w:strike w:val="0"/>
         </w:rPr>
-        <w:t>"We stay," she said. "Tonight. He talks tomorrow, all of it. And if he doesn't, we walk."</w:t>
+        <w:t>"We stay," she said. "Tonight. He talks tomorrow, all of it. And if he doesn't, I stop telling Gage to stop."</w:t>
       </w:r>
     </w:p>
     <w:p>

</xml_diff>

<commit_message>
Ch2 round 6: Camilla counts the medics' wait; clarify the gates memory
Add "*Waited.* While she lay on the metal with Ben's sealant still wet on
her stump. Camilla added it to the count." after Flitzberg's excuse. The
guards now wait for "the broken boy they'd been told to expect". Cut "the
strangest feeling of the world folding over on itself". Opus/Fable drafts;
blind reviews 8.7 vs 8.0 (Sonnet), 8.5 vs 8 (Haiku). Regenerate the Word
file.

Co-Authored-By: Claude Opus 5.5 <noreply@anthropic.com>
</commit_message>
<xml_diff>
--- a/claude-notes/manuscript-v2/02-now-the-throat-merged.docx
+++ b/claude-notes/manuscript-v2/02-now-the-throat-merged.docx
@@ -382,6 +382,24 @@
           <w:strike w:val="0"/>
         </w:rPr>
         <w:t>He raised one hand where they could all see it and beckoned at the glass. "If a stranger had reached her before I did, you would have broken him. So they waited, and I came first."</w:t>
+      </w:r>
+    </w:p>
+    <w:p>
+      <w:r>
+        <w:rPr>
+          <w:b w:val="0"/>
+          <w:i/>
+          <w:strike w:val="0"/>
+        </w:rPr>
+        <w:t>Waited.</w:t>
+      </w:r>
+      <w:r>
+        <w:rPr>
+          <w:b w:val="0"/>
+          <w:i w:val="0"/>
+          <w:strike w:val="0"/>
+        </w:rPr>
+        <w:t xml:space="preserve"> While she lay on the metal with Ben's sealant still wet on her stump. Camilla added it to the count.</w:t>
       </w:r>
     </w:p>
     <w:p>
@@ -1037,7 +1055,7 @@
           <w:i w:val="0"/>
           <w:strike w:val="0"/>
         </w:rPr>
-        <w:t>Gage went to Otto. He said Otto's name once and got nothing back. Then he bent, took Otto's arm across his shoulders, and lifted him, and Camilla had the strangest feeling of the world folding over on itself. She'd seen this before: months ago, at the end of the Initiation, outside the mine gates on the fourth morning, Gage walking up out of the dark with Otto across his shoulders and Ben by the collar, while the guards waited for a broken boy who never came.</w:t>
+        <w:t>Gage went to Otto. He said Otto's name once and got nothing back. Then he bent, took Otto's arm across his shoulders, and lifted him. She'd seen this before: months ago, at the end of the Initiation, outside the mine gates on the fourth morning, Gage walking up out of the dark with Otto across his shoulders and Ben by the collar, while the guards waited for the broken boy they'd been told to expect.</w:t>
       </w:r>
     </w:p>
     <w:p>

</xml_diff>

<commit_message>
Ch2: cut one counting line before the close
Co-Authored-By: Claude Opus 5.5 <noreply@anthropic.com>
</commit_message>
<xml_diff>
--- a/claude-notes/manuscript-v2/02-now-the-throat-merged.docx
+++ b/claude-notes/manuscript-v2/02-now-the-throat-merged.docx
@@ -20,7 +20,6 @@
         <w:rPr>
           <w:b w:val="0"/>
           <w:i/>
-          <w:strike w:val="0"/>
           <w:color w:val="5C6B7D"/>
         </w:rPr>
         <w:t>“If I tell you to stop, you stop. Even if every part of you is screaming to charge. You stop.”</w:t>
@@ -31,7 +30,6 @@
         <w:rPr>
           <w:b w:val="0"/>
           <w:i/>
-          <w:strike w:val="0"/>
           <w:color w:val="5C6B7D"/>
         </w:rPr>
         <w:t>— Book 1, Chapter 22: The Engine and Eyes</w:t>
@@ -51,7 +49,6 @@
         <w:rPr>
           <w:b w:val="0"/>
           <w:i w:val="0"/>
-          <w:strike w:val="0"/>
         </w:rPr>
         <w:t>Cold first. Metal floor, flat against her shoulder blade and the back of her skull. Then a second cold, smaller and wetter, on the place where her left arm stopped. Fresh sealant. It hadn't set yet; it still had the chill of the can in it. Thick at the front, thin at the back. Whoever had sprayed it had been shaking, and hadn't wanted to look.</w:t>
       </w:r>
@@ -61,7 +58,6 @@
         <w:rPr>
           <w:b w:val="0"/>
           <w:i w:val="0"/>
-          <w:strike w:val="0"/>
         </w:rPr>
         <w:t>Ben, then. Gage didn't shake when he worked. Gage pressed too hard.</w:t>
       </w:r>
@@ -71,7 +67,6 @@
         <w:rPr>
           <w:b w:val="0"/>
           <w:i w:val="0"/>
-          <w:strike w:val="0"/>
         </w:rPr>
         <w:t>Her left hand closed. She felt the fingers curl, the thumb come across the knuckles, the small pull in the forearm. None of it was there. She'd explained this once to Gerald, back home, about the leg he didn't have anymore: the map stays drawn after the country's gone. She hadn't known what it felt like from the inside. She let the hand that didn't exist stay closed. She'd deal with it later.</w:t>
       </w:r>
@@ -81,7 +76,6 @@
         <w:rPr>
           <w:b w:val="0"/>
           <w:i w:val="0"/>
-          <w:strike w:val="0"/>
         </w:rPr>
         <w:t>Voices came before her eyes did.</w:t>
       </w:r>
@@ -91,7 +85,6 @@
         <w:rPr>
           <w:b w:val="0"/>
           <w:i w:val="0"/>
-          <w:strike w:val="0"/>
         </w:rPr>
         <w:t>"Why?" Her brother, cracked down the middle. "Otto is here and still gone. Camilla is half-dead. What did we ever do to you?"</w:t>
       </w:r>
@@ -101,7 +94,6 @@
         <w:rPr>
           <w:b w:val="0"/>
           <w:i/>
-          <w:strike w:val="0"/>
         </w:rPr>
         <w:t>Half-dead.</w:t>
       </w:r>
@@ -109,7 +101,6 @@
         <w:rPr>
           <w:b w:val="0"/>
           <w:i w:val="0"/>
-          <w:strike w:val="0"/>
         </w:rPr>
         <w:t xml:space="preserve"> So that was how she looked from up there.</w:t>
       </w:r>
@@ -119,7 +110,6 @@
         <w:rPr>
           <w:b w:val="0"/>
           <w:i w:val="0"/>
-          <w:strike w:val="0"/>
         </w:rPr>
         <w:t>"Wrong question." Smooth, made, even. "Ask what was taken from your parents, and who signed for it."</w:t>
       </w:r>
@@ -129,7 +119,6 @@
         <w:rPr>
           <w:b w:val="0"/>
           <w:i w:val="0"/>
-          <w:strike w:val="0"/>
         </w:rPr>
         <w:t>"What does that mean?" Ben, from somewhere low and close.</w:t>
       </w:r>
@@ -139,7 +128,6 @@
         <w:rPr>
           <w:b w:val="0"/>
           <w:i w:val="0"/>
-          <w:strike w:val="0"/>
         </w:rPr>
         <w:t>"That somebody signed. Signatures leave records. You are ready now to read them."</w:t>
       </w:r>
@@ -149,7 +137,6 @@
         <w:rPr>
           <w:b w:val="0"/>
           <w:i w:val="0"/>
-          <w:strike w:val="0"/>
         </w:rPr>
         <w:t>Then someone was choking.</w:t>
       </w:r>
@@ -159,7 +146,6 @@
         <w:rPr>
           <w:b w:val="0"/>
           <w:i w:val="0"/>
-          <w:strike w:val="0"/>
         </w:rPr>
         <w:t>She opened her eyes.</w:t>
       </w:r>
@@ -169,7 +155,6 @@
         <w:rPr>
           <w:b w:val="0"/>
           <w:i w:val="0"/>
-          <w:strike w:val="0"/>
         </w:rPr>
         <w:t>White light, everywhere, the kind that didn't flicker because nothing was burning to make it. She turned her head on the floor and took the room in a piece at a time.</w:t>
       </w:r>
@@ -179,7 +164,6 @@
         <w:rPr>
           <w:b w:val="0"/>
           <w:i w:val="0"/>
-          <w:strike w:val="0"/>
         </w:rPr>
         <w:t>Gage, back to her, feet planted, all two hundred and twenty pounds of him set behind one arm, and at the end of the arm a hand, and in the hand Mr. Flitzberg's throat.</w:t>
       </w:r>
@@ -189,7 +173,6 @@
         <w:rPr>
           <w:b w:val="0"/>
           <w:i w:val="0"/>
-          <w:strike w:val="0"/>
         </w:rPr>
         <w:t>Flitzberg hadn't moved. Hands at his sides. His face was going a bad color, but his eyes were still doing what they always did, which was measure. He wasn't reaching for Gage's wrist.</w:t>
       </w:r>
@@ -199,7 +182,6 @@
         <w:rPr>
           <w:b w:val="0"/>
           <w:i w:val="0"/>
-          <w:strike w:val="0"/>
         </w:rPr>
         <w:t>Ben, on his knees two body-lengths away, the spray can still in his fist.</w:t>
       </w:r>
@@ -209,7 +191,6 @@
         <w:rPr>
           <w:b w:val="0"/>
           <w:i w:val="0"/>
-          <w:strike w:val="0"/>
         </w:rPr>
         <w:t>Otto. Standing, square to the room, arms at his sides. Chest rising, chest falling. Eyes open, and nothing behind them. He was looking at the far wall, and only at the wall.</w:t>
       </w:r>
@@ -219,7 +200,6 @@
         <w:rPr>
           <w:b w:val="0"/>
           <w:i w:val="0"/>
-          <w:strike w:val="0"/>
         </w:rPr>
         <w:t>Behind him, the crystal. Three quarters green. The last quarter pulsing a slow, cold blue.</w:t>
       </w:r>
@@ -229,7 +209,6 @@
         <w:rPr>
           <w:b w:val="0"/>
           <w:i w:val="0"/>
-          <w:strike w:val="0"/>
         </w:rPr>
         <w:t>She counted, because counting was what she did when nothing else would hold still. Gage. Ben. Otto. Her. Four of them. And Flitzberg.</w:t>
       </w:r>
@@ -239,7 +218,6 @@
         <w:rPr>
           <w:b w:val="0"/>
           <w:i w:val="0"/>
-          <w:strike w:val="0"/>
         </w:rPr>
         <w:t>She checked his jaw. The first time they'd met, he'd been wearing her dead grandfather's face, and a seam of light at the hinge had given him away. No seam now. Pale, smooth, full-cheeked, darkening under Gage's hand. His own face, she thought. Probably.</w:t>
       </w:r>
@@ -249,7 +227,6 @@
         <w:rPr>
           <w:b w:val="0"/>
           <w:i w:val="0"/>
-          <w:strike w:val="0"/>
         </w:rPr>
         <w:t>There were no guards in the room. Nobody behind the glass was moving. The man who ran this place had walked in alone and let the strongest boy in Sector One get a hand on his windpipe. Either he'd lost his mind, or he wanted to be within reach.</w:t>
       </w:r>
@@ -259,7 +236,6 @@
         <w:rPr>
           <w:b w:val="0"/>
           <w:i w:val="0"/>
-          <w:strike w:val="0"/>
         </w:rPr>
         <w:t>She didn't think he'd lost his mind.</w:t>
       </w:r>
@@ -269,7 +245,6 @@
         <w:rPr>
           <w:b w:val="0"/>
           <w:i w:val="0"/>
-          <w:strike w:val="0"/>
         </w:rPr>
         <w:t>Gage's grip was trembling. It hadn't tightened. The long muscles in his forearm were jumping.</w:t>
       </w:r>
@@ -279,7 +254,6 @@
         <w:rPr>
           <w:b w:val="0"/>
           <w:i w:val="0"/>
-          <w:strike w:val="0"/>
         </w:rPr>
         <w:t>"You are angry at the right person," Flitzberg got out. He had to stop and swallow, and she watched it go down him. "The right person is also the only one who will answer you. That is why I came in alone."</w:t>
       </w:r>
@@ -289,7 +263,6 @@
         <w:rPr>
           <w:b w:val="0"/>
           <w:i w:val="0"/>
-          <w:strike w:val="0"/>
         </w:rPr>
         <w:t>Gage's arm shook harder.</w:t>
       </w:r>
@@ -299,7 +272,6 @@
         <w:rPr>
           <w:b w:val="0"/>
           <w:i w:val="0"/>
-          <w:strike w:val="0"/>
         </w:rPr>
         <w:t>She tried to say his name, and nothing came up behind it. She wet her lips. Tried again.</w:t>
       </w:r>
@@ -309,7 +281,6 @@
         <w:rPr>
           <w:b w:val="0"/>
           <w:i w:val="0"/>
-          <w:strike w:val="0"/>
         </w:rPr>
         <w:t>"Gage."</w:t>
       </w:r>
@@ -319,7 +290,6 @@
         <w:rPr>
           <w:b w:val="0"/>
           <w:i w:val="0"/>
-          <w:strike w:val="0"/>
         </w:rPr>
         <w:t>His head turned a quarter inch.</w:t>
       </w:r>
@@ -329,7 +299,6 @@
         <w:rPr>
           <w:b w:val="0"/>
           <w:i w:val="0"/>
-          <w:strike w:val="0"/>
         </w:rPr>
         <w:t>"Stop."</w:t>
       </w:r>
@@ -339,7 +308,6 @@
         <w:rPr>
           <w:b w:val="0"/>
           <w:i w:val="0"/>
-          <w:strike w:val="0"/>
         </w:rPr>
         <w:t>He'd promised her that, outside the four doors. He'd kept it once already, with the shock still in his bones. His hand opened, one finger at a time, as if each one had to be argued with separately. He stepped back. Not far.</w:t>
       </w:r>
@@ -349,7 +317,6 @@
         <w:rPr>
           <w:b w:val="0"/>
           <w:i w:val="0"/>
-          <w:strike w:val="0"/>
         </w:rPr>
         <w:t>Flitzberg didn't rub his throat. He left the marks where they could see them.</w:t>
       </w:r>
@@ -359,7 +326,6 @@
         <w:rPr>
           <w:b w:val="0"/>
           <w:i w:val="0"/>
-          <w:strike w:val="0"/>
         </w:rPr>
         <w:t>"Then answer," Gage said. "Why? What did we ever do to you?"</w:t>
       </w:r>
@@ -369,7 +335,6 @@
         <w:rPr>
           <w:b w:val="0"/>
           <w:i w:val="0"/>
-          <w:strike w:val="0"/>
         </w:rPr>
         <w:t>"Nothing." Flitzberg's voice came out scraped. "You were not —" He stopped, and swallowed, and it cost him. "You were not punished. You were chosen. I know those look the same from where you stand." He swallowed again, and waited for his voice. "At your Initiation the city could not decide whose you were. Three names, no house. No one answerable for whether you came back up. I watched it fail to decide, and I decided." His eyes went to Camilla on the floor. "Your sister needs more than a spray can. Then you can hate me properly."</w:t>
       </w:r>
@@ -379,7 +344,6 @@
         <w:rPr>
           <w:b w:val="0"/>
           <w:i w:val="0"/>
-          <w:strike w:val="0"/>
         </w:rPr>
         <w:t>He raised one hand where they could all see it and beckoned at the glass. "If a stranger had reached her before I did, you would have broken him. So they waited, and I came first."</w:t>
       </w:r>
@@ -389,7 +353,6 @@
         <w:rPr>
           <w:b w:val="0"/>
           <w:i/>
-          <w:strike w:val="0"/>
         </w:rPr>
         <w:t>Waited.</w:t>
       </w:r>
@@ -397,7 +360,6 @@
         <w:rPr>
           <w:b w:val="0"/>
           <w:i w:val="0"/>
-          <w:strike w:val="0"/>
         </w:rPr>
         <w:t xml:space="preserve"> While she lay on the metal with Ben's sealant still wet on her stump. Camilla added it to the count.</w:t>
       </w:r>
@@ -407,7 +369,6 @@
         <w:rPr>
           <w:b w:val="0"/>
           <w:i w:val="0"/>
-          <w:strike w:val="0"/>
         </w:rPr>
         <w:t>Three people came in fast, two with a wheeled stretcher, one with cases, sleeves pushed up. Ben was between them and Camilla before the door finished opening, the can held up like a weapon.</w:t>
       </w:r>
@@ -417,7 +378,6 @@
         <w:rPr>
           <w:b w:val="0"/>
           <w:i w:val="0"/>
-          <w:strike w:val="0"/>
         </w:rPr>
         <w:t>The oldest of them, a woman with grey at her temples and hands scrubbed pink, stopped dead. She set her case on the floor, opened it and turned it so Ben could see inside.</w:t>
       </w:r>
@@ -427,7 +387,6 @@
         <w:rPr>
           <w:b w:val="0"/>
           <w:i w:val="0"/>
-          <w:strike w:val="0"/>
         </w:rPr>
         <w:t>"Clean sealant. Blood. Pain control that won't fog her." She didn't move toward Camilla. "You can walk next to the stretcher with your hand on her the whole way. Nobody's going to make you let go."</w:t>
       </w:r>
@@ -437,7 +396,6 @@
         <w:rPr>
           <w:b w:val="0"/>
           <w:i w:val="0"/>
-          <w:strike w:val="0"/>
         </w:rPr>
         <w:t>Ben looked at Gage. Gage looked at the case. Camilla looked too: sealed instruments in fitted foam, every one of them bright. Nothing she'd ever owned had been bright.</w:t>
       </w:r>
@@ -447,7 +405,6 @@
         <w:rPr>
           <w:b w:val="0"/>
           <w:i w:val="0"/>
-          <w:strike w:val="0"/>
         </w:rPr>
         <w:t>Gage nodded.</w:t>
       </w:r>
@@ -457,7 +414,6 @@
         <w:rPr>
           <w:b w:val="0"/>
           <w:i w:val="0"/>
-          <w:strike w:val="0"/>
         </w:rPr>
         <w:t>The two with the stretcher bent to her.</w:t>
       </w:r>
@@ -467,7 +423,6 @@
         <w:rPr>
           <w:b w:val="0"/>
           <w:i w:val="0"/>
-          <w:strike w:val="0"/>
         </w:rPr>
         <w:t>"No," Camilla said. "Him first." She couldn't lift the arm she wanted to lift, so she lifted the other one, two inches off the floor, and let it fall toward Otto. "Him. Then me."</w:t>
       </w:r>
@@ -477,7 +432,6 @@
         <w:rPr>
           <w:b w:val="0"/>
           <w:i w:val="0"/>
-          <w:strike w:val="0"/>
         </w:rPr>
         <w:t>The medic looked at the boy standing in the middle of the room breathing like a sleeper. She said one word to the third medic, who took a light and a grey instrument to Otto.</w:t>
       </w:r>
@@ -487,7 +441,6 @@
         <w:rPr>
           <w:b w:val="0"/>
           <w:i w:val="0"/>
-          <w:strike w:val="0"/>
         </w:rPr>
         <w:t>"Then we do you here," she told Camilla, and knelt. "Hold still."</w:t>
       </w:r>
@@ -497,7 +450,6 @@
         <w:rPr>
           <w:b w:val="0"/>
           <w:i w:val="0"/>
-          <w:strike w:val="0"/>
         </w:rPr>
         <w:t>"I've had practice."</w:t>
       </w:r>
@@ -507,7 +459,6 @@
         <w:rPr>
           <w:b w:val="0"/>
           <w:i w:val="0"/>
-          <w:strike w:val="0"/>
         </w:rPr>
         <w:t>The new sealant went on over Ben's, colder and deeper, and under it came the first warmth her shoulder had given her since the drone. A line went into the back of her right hand. The clear bag above her started to empty. For a while nothing changed, and then everything did: the room's edges came back sharp.</w:t>
       </w:r>
@@ -517,7 +468,6 @@
         <w:rPr>
           <w:b w:val="0"/>
           <w:i w:val="0"/>
-          <w:strike w:val="0"/>
         </w:rPr>
         <w:t>Across the room, the third medic shone the light in Otto's eyes. Left, right. His pupils did what pupils do. His face did nothing. The instrument went to his neck, his wrist, his chest. The medic looked at Flitzberg and didn't need to say anything.</w:t>
       </w:r>
@@ -527,7 +477,6 @@
         <w:rPr>
           <w:b w:val="0"/>
           <w:i w:val="0"/>
-          <w:strike w:val="0"/>
         </w:rPr>
         <w:t>"What's wrong with him?" Ben's voice cracked. "He's right there. He's breathing. Why won't he come back?"</w:t>
       </w:r>
@@ -537,7 +486,6 @@
         <w:rPr>
           <w:b w:val="0"/>
           <w:i w:val="0"/>
-          <w:strike w:val="0"/>
         </w:rPr>
         <w:t>Flitzberg looked past him at Otto, the boy who'd held ten stones open over a lake of fire so the rest of them could drop through, and had stayed behind to do it.</w:t>
       </w:r>
@@ -547,7 +495,6 @@
         <w:rPr>
           <w:b w:val="0"/>
           <w:i w:val="0"/>
-          <w:strike w:val="0"/>
         </w:rPr>
         <w:t>"I do not know."</w:t>
       </w:r>
@@ -557,7 +504,6 @@
         <w:rPr>
           <w:b w:val="0"/>
           <w:i w:val="0"/>
-          <w:strike w:val="0"/>
         </w:rPr>
         <w:t>"You did this."</w:t>
       </w:r>
@@ -567,7 +513,6 @@
         <w:rPr>
           <w:b w:val="0"/>
           <w:i w:val="0"/>
-          <w:strike w:val="0"/>
         </w:rPr>
         <w:t>"Yes. And I do not know." He let that sit. "Our instruments say he is well. Heart, breath, all of it. The instruments are wrong. Some part of him spent itself in that room, and it has not come back. We will keep his body strong and his door open. I will not pretend to more than that."</w:t>
       </w:r>
@@ -577,7 +522,6 @@
         <w:rPr>
           <w:b w:val="0"/>
           <w:i w:val="0"/>
-          <w:strike w:val="0"/>
         </w:rPr>
         <w:t>"That's not good enough," Gage said.</w:t>
       </w:r>
@@ -587,7 +531,6 @@
         <w:rPr>
           <w:b w:val="0"/>
           <w:i w:val="0"/>
-          <w:strike w:val="0"/>
         </w:rPr>
         <w:t>"It is what there is."</w:t>
       </w:r>
@@ -597,7 +540,6 @@
         <w:rPr>
           <w:b w:val="0"/>
           <w:i w:val="0"/>
-          <w:strike w:val="0"/>
         </w:rPr>
         <w:t>Gage took a step toward him. Flitzberg didn't take one back.</w:t>
       </w:r>
@@ -607,7 +549,6 @@
         <w:rPr>
           <w:b w:val="0"/>
           <w:i w:val="0"/>
-          <w:strike w:val="0"/>
         </w:rPr>
         <w:t>"The guard at the doors," Gage said. "'Pass all four, you live. Fail—' He didn't finish. You finish it."</w:t>
       </w:r>
@@ -617,7 +558,6 @@
         <w:rPr>
           <w:b w:val="0"/>
           <w:i w:val="0"/>
-          <w:strike w:val="0"/>
         </w:rPr>
         <w:t>"Some who fail die." Flitzberg didn't soften it. "Not by our hand. But the rooms are not theater. That drone was not pretending. When a team breaks in there, the rooms do not get gentler."</w:t>
       </w:r>
@@ -627,7 +567,6 @@
         <w:rPr>
           <w:b w:val="0"/>
           <w:i w:val="0"/>
-          <w:strike w:val="0"/>
         </w:rPr>
         <w:t>"And Camilla's arm?" Ben was crying now and not hiding it. "And Otto? That was the price?"</w:t>
       </w:r>
@@ -637,7 +576,6 @@
         <w:rPr>
           <w:b w:val="0"/>
           <w:i w:val="0"/>
-          <w:strike w:val="0"/>
         </w:rPr>
         <w:t>"Yes."</w:t>
       </w:r>
@@ -647,7 +585,6 @@
         <w:rPr>
           <w:b w:val="0"/>
           <w:i w:val="0"/>
-          <w:strike w:val="0"/>
         </w:rPr>
         <w:t>The medic's hands kept working. The bag kept emptying.</w:t>
       </w:r>
@@ -657,7 +594,6 @@
         <w:rPr>
           <w:b w:val="0"/>
           <w:i w:val="0"/>
-          <w:strike w:val="0"/>
         </w:rPr>
         <w:t>"She paid it on her feet," Flitzberg said to Gage. "Remember that, before anything else about tonight."</w:t>
       </w:r>
@@ -667,7 +603,6 @@
         <w:rPr>
           <w:b w:val="0"/>
           <w:i w:val="0"/>
-          <w:strike w:val="0"/>
         </w:rPr>
         <w:t>"Don't," Camilla said.</w:t>
       </w:r>
@@ -677,7 +612,6 @@
         <w:rPr>
           <w:b w:val="0"/>
           <w:i w:val="0"/>
-          <w:strike w:val="0"/>
         </w:rPr>
         <w:t>He looked down at her.</w:t>
       </w:r>
@@ -687,7 +621,6 @@
         <w:rPr>
           <w:b w:val="0"/>
           <w:i w:val="0"/>
-          <w:strike w:val="0"/>
         </w:rPr>
         <w:t>"Don't make it a story." Her voice shook and she let it. "I didn't stand up to anything. I counted. Somebody had to count."</w:t>
       </w:r>
@@ -697,7 +630,6 @@
         <w:rPr>
           <w:b w:val="0"/>
           <w:i w:val="0"/>
-          <w:strike w:val="0"/>
         </w:rPr>
         <w:t>"And somebody had to pay," Flitzberg said. "Both of those are true. I will not take either one back to make this easier for you."</w:t>
       </w:r>
@@ -707,7 +639,6 @@
         <w:rPr>
           <w:b w:val="0"/>
           <w:i w:val="0"/>
-          <w:strike w:val="0"/>
         </w:rPr>
         <w:t>She didn't know what to do with her face.</w:t>
       </w:r>
@@ -717,7 +648,6 @@
         <w:rPr>
           <w:b w:val="0"/>
           <w:i w:val="0"/>
-          <w:strike w:val="0"/>
         </w:rPr>
         <w:t>Gage turned to the door they'd come in by. "We're going home."</w:t>
       </w:r>
@@ -727,7 +657,6 @@
         <w:rPr>
           <w:b w:val="0"/>
           <w:i w:val="0"/>
-          <w:strike w:val="0"/>
         </w:rPr>
         <w:t>"Not tonight."</w:t>
       </w:r>
@@ -737,7 +666,6 @@
         <w:rPr>
           <w:b w:val="0"/>
           <w:i w:val="0"/>
-          <w:strike w:val="0"/>
         </w:rPr>
         <w:t>"You don't get to say—"</w:t>
       </w:r>
@@ -747,7 +675,6 @@
         <w:rPr>
           <w:b w:val="0"/>
           <w:i w:val="0"/>
-          <w:strike w:val="0"/>
         </w:rPr>
         <w:t xml:space="preserve">"In four days," Flitzberg said, and his voice gave out on him again, and he made it work, "the mine writes one word next to your three names on the shift roll. </w:t>
       </w:r>
@@ -755,7 +682,6 @@
         <w:rPr>
           <w:b w:val="0"/>
           <w:i/>
-          <w:strike w:val="0"/>
         </w:rPr>
         <w:t>Absconded.</w:t>
       </w:r>
@@ -763,7 +689,6 @@
         <w:rPr>
           <w:b w:val="0"/>
           <w:i w:val="0"/>
-          <w:strike w:val="0"/>
         </w:rPr>
         <w:t xml:space="preserve"> It is the kindest word it has. Nobody bills a street for a boy who ran. Your slots go back in the pool, Camilla's ration card is not drawn again, and nobody asks why. Miner Town does not go looking for children who walk away." He swallowed. "Before then, you choose. Stay, or go home with a story I give you, one that holds. Walk back through those gates tonight, bleeding, with no story, and you are the trouble the city bills your street for. Rations short. Quotas up. Somebody's door kicked in who had nothing to do with you."</w:t>
       </w:r>
@@ -773,7 +698,6 @@
         <w:rPr>
           <w:b w:val="0"/>
           <w:i w:val="0"/>
-          <w:strike w:val="0"/>
         </w:rPr>
         <w:t>Ben's head came up. "Gretchen's at the gates. She'll be there tomorrow. She'll be there every day."</w:t>
       </w:r>
@@ -783,7 +707,6 @@
         <w:rPr>
           <w:b w:val="0"/>
           <w:i w:val="0"/>
-          <w:strike w:val="0"/>
         </w:rPr>
         <w:t>"I know."</w:t>
       </w:r>
@@ -793,7 +716,6 @@
         <w:rPr>
           <w:b w:val="0"/>
           <w:i w:val="0"/>
-          <w:strike w:val="0"/>
         </w:rPr>
         <w:t>"Then tell her."</w:t>
       </w:r>
@@ -803,7 +725,6 @@
         <w:rPr>
           <w:b w:val="0"/>
           <w:i w:val="0"/>
-          <w:strike w:val="0"/>
         </w:rPr>
         <w:t>"I cannot send word up. Nothing goes up that the ground could read." Flitzberg looked away from them, at the glass. He hadn't done that yet. "I am sorry. That is not a thing I can fix tonight."</w:t>
       </w:r>
@@ -813,7 +734,6 @@
         <w:rPr>
           <w:b w:val="0"/>
           <w:i w:val="0"/>
-          <w:strike w:val="0"/>
         </w:rPr>
         <w:t>Ben laughed, once, wet and ugly. "So she stands there four days, and then they write it down, and she stands there anyway." He wiped his face with his wrist. "She'll think I ran."</w:t>
       </w:r>
@@ -823,7 +743,6 @@
         <w:rPr>
           <w:b w:val="0"/>
           <w:i w:val="0"/>
-          <w:strike w:val="0"/>
         </w:rPr>
         <w:t>"She will," Flitzberg said. "Until you tell her otherwise."</w:t>
       </w:r>
@@ -833,7 +752,6 @@
         <w:rPr>
           <w:b w:val="0"/>
           <w:i w:val="0"/>
-          <w:strike w:val="0"/>
         </w:rPr>
         <w:t>Gage's hands had closed. Camilla watched them close.</w:t>
       </w:r>
@@ -843,7 +761,6 @@
         <w:rPr>
           <w:b w:val="0"/>
           <w:i w:val="0"/>
-          <w:strike w:val="0"/>
         </w:rPr>
         <w:t>Then he turned his back on Flitzberg and came to her, and went down on one knee beside the medic, and got an arm under her shoulders. His other hand went under her knees. He was careful of the sealant. He didn't see the line in the back of her hand.</w:t>
       </w:r>
@@ -853,7 +770,6 @@
         <w:rPr>
           <w:b w:val="0"/>
           <w:i w:val="0"/>
-          <w:strike w:val="0"/>
         </w:rPr>
         <w:t>"Hey." The medic's hand came down flat on his forearm. "She's got a line in. You lift her now and that shoulder opens before you're out of this room."</w:t>
       </w:r>
@@ -863,7 +779,6 @@
         <w:rPr>
           <w:b w:val="0"/>
           <w:i w:val="0"/>
-          <w:strike w:val="0"/>
         </w:rPr>
         <w:t>"Then pull it."</w:t>
       </w:r>
@@ -873,7 +788,6 @@
         <w:rPr>
           <w:b w:val="0"/>
           <w:i w:val="0"/>
-          <w:strike w:val="0"/>
         </w:rPr>
         <w:t>"I'm not pulling it."</w:t>
       </w:r>
@@ -883,7 +797,6 @@
         <w:rPr>
           <w:b w:val="0"/>
           <w:i w:val="0"/>
-          <w:strike w:val="0"/>
         </w:rPr>
         <w:t>"Ben." Gage didn't look up. "Get Otto."</w:t>
       </w:r>
@@ -893,7 +806,6 @@
         <w:rPr>
           <w:b w:val="0"/>
           <w:i w:val="0"/>
-          <w:strike w:val="0"/>
         </w:rPr>
         <w:t>Ben tried to stand. He got one foot under himself and swayed, and put a hand down on the floor to stop it, and stayed there.</w:t>
       </w:r>
@@ -903,7 +815,6 @@
         <w:rPr>
           <w:b w:val="0"/>
           <w:i w:val="0"/>
-          <w:strike w:val="0"/>
         </w:rPr>
         <w:t>"Gage." Camilla's head was against his chest. She could feel him breathing, too fast, end-of-shift fast. "Look at Ben. He can't get up. Who's carrying Otto?"</w:t>
       </w:r>
@@ -913,7 +824,6 @@
         <w:rPr>
           <w:b w:val="0"/>
           <w:i w:val="0"/>
-          <w:strike w:val="0"/>
         </w:rPr>
         <w:t>"I'll come back for him."</w:t>
       </w:r>
@@ -923,7 +833,6 @@
         <w:rPr>
           <w:b w:val="0"/>
           <w:i w:val="0"/>
-          <w:strike w:val="0"/>
         </w:rPr>
         <w:t>"All the way up, and through the gates, and back down. With me on you, and him at the top with nobody." She made herself say the rest. "Gage. I counted him. I've been counting all of you since I opened my eyes, and every time I get to him I get nothing back. He's breathing and he isn't there, and I've been lying here not saying it. He can't eat. He can't drink unless somebody makes him. If we carry him home, Ma can't do that for long. I can't. He stays where the machines are, or he dies in a shack with his eyes open, and I'll be the one who counted that."</w:t>
       </w:r>
@@ -933,7 +842,6 @@
         <w:rPr>
           <w:b w:val="0"/>
           <w:i w:val="0"/>
-          <w:strike w:val="0"/>
         </w:rPr>
         <w:t>Gage had stopped moving. She felt the stop go through him.</w:t>
       </w:r>
@@ -943,7 +851,6 @@
         <w:rPr>
           <w:b w:val="0"/>
           <w:i w:val="0"/>
-          <w:strike w:val="0"/>
         </w:rPr>
         <w:t>"You can carry me," she said. "You're already doing it. You can't carry him home."</w:t>
       </w:r>
@@ -953,7 +860,6 @@
         <w:rPr>
           <w:b w:val="0"/>
           <w:i w:val="0"/>
-          <w:strike w:val="0"/>
         </w:rPr>
         <w:t>Ben made a sound on the floor. Flitzberg stood where he was and said nothing, and his hands stayed at his sides.</w:t>
       </w:r>
@@ -963,7 +869,6 @@
         <w:rPr>
           <w:b w:val="0"/>
           <w:i w:val="0"/>
-          <w:strike w:val="0"/>
         </w:rPr>
         <w:t>"We stay," she said. "Tonight. He talks tomorrow, all of it. And if he doesn't, I stop telling Gage to stop."</w:t>
       </w:r>
@@ -973,7 +878,6 @@
         <w:rPr>
           <w:b w:val="0"/>
           <w:i w:val="0"/>
-          <w:strike w:val="0"/>
         </w:rPr>
         <w:t>Gage looked at her for a long time. Then he laid her back down on the floor, and his hands came open, slowly, and he stayed on his knee beside her.</w:t>
       </w:r>
@@ -983,7 +887,6 @@
         <w:rPr>
           <w:b w:val="0"/>
           <w:i w:val="0"/>
-          <w:strike w:val="0"/>
         </w:rPr>
         <w:t>"Tomorrow," he said to Flitzberg. "All of it."</w:t>
       </w:r>
@@ -993,7 +896,6 @@
         <w:rPr>
           <w:b w:val="0"/>
           <w:i w:val="0"/>
-          <w:strike w:val="0"/>
         </w:rPr>
         <w:t>"All of it," Flitzberg said. "Then you choose. You have my word."</w:t>
       </w:r>
@@ -1003,7 +905,6 @@
         <w:rPr>
           <w:b w:val="0"/>
           <w:i w:val="0"/>
-          <w:strike w:val="0"/>
         </w:rPr>
         <w:t>The medic let out her breath, and checked the line, and taped it flat against Camilla's hand. "That stays in. You'll be stronger by morning, and you'll hate the tape. Both are fine." She nodded to the others. "Now."</w:t>
       </w:r>
@@ -1013,7 +914,6 @@
         <w:rPr>
           <w:b w:val="0"/>
           <w:i w:val="0"/>
-          <w:strike w:val="0"/>
         </w:rPr>
         <w:t>They lifted her: four hands under her, nothing jarred, nothing left to find its own way. She'd never been lifted. In Miner Town you got dragged. Ben came with her, his hand on her good shoulder, exactly as he'd been told he could.</w:t>
       </w:r>
@@ -1023,7 +923,6 @@
         <w:rPr>
           <w:b w:val="0"/>
           <w:i w:val="0"/>
-          <w:strike w:val="0"/>
         </w:rPr>
         <w:t>Flitzberg went to the inner doors. They opened on a corridor, and the lights woke one at a time ahead of them, each a step beyond the last.</w:t>
       </w:r>
@@ -1033,7 +932,6 @@
         <w:rPr>
           <w:b w:val="0"/>
           <w:i w:val="0"/>
-          <w:strike w:val="0"/>
         </w:rPr>
         <w:t>"Eat," he said. "Sleep. Sit with your friend and talk to him. For all our instruments can tell, he hears every word."</w:t>
       </w:r>
@@ -1043,7 +941,6 @@
         <w:rPr>
           <w:b w:val="0"/>
           <w:i w:val="0"/>
-          <w:strike w:val="0"/>
         </w:rPr>
         <w:t>From the stretcher, flat on her back, Camilla got the room one last time.</w:t>
       </w:r>
@@ -1053,7 +950,6 @@
         <w:rPr>
           <w:b w:val="0"/>
           <w:i w:val="0"/>
-          <w:strike w:val="0"/>
         </w:rPr>
         <w:t>Gage went to Otto. He said Otto's name once and got nothing back. Then he bent, took Otto's arm across his shoulders, and lifted him. She'd seen this before: months ago, at the end of the Initiation, outside the mine gates on the fourth morning, Gage walking up out of the dark with Otto across his shoulders and Ben by the collar, while the guards waited for the broken boy they'd been told to expect.</w:t>
       </w:r>
@@ -1063,7 +959,6 @@
         <w:rPr>
           <w:b w:val="0"/>
           <w:i w:val="0"/>
-          <w:strike w:val="0"/>
         </w:rPr>
         <w:t>He was carrying Otto out again. This time Otto didn't know it.</w:t>
       </w:r>
@@ -1073,7 +968,6 @@
         <w:rPr>
           <w:b w:val="0"/>
           <w:i w:val="0"/>
-          <w:strike w:val="0"/>
         </w:rPr>
         <w:t>Behind the empty place where Otto had stood, the crystal. Still a quarter blue.</w:t>
       </w:r>
@@ -1083,17 +977,6 @@
         <w:rPr>
           <w:b w:val="0"/>
           <w:i w:val="0"/>
-          <w:strike w:val="0"/>
-        </w:rPr>
-        <w:t>She counted them through the door. Gage, with Otto on his back. Ben, beside her. Herself.</w:t>
-      </w:r>
-    </w:p>
-    <w:p>
-      <w:r>
-        <w:rPr>
-          <w:b w:val="0"/>
-          <w:i w:val="0"/>
-          <w:strike w:val="0"/>
         </w:rPr>
         <w:t>Four of them. Three awake.</w:t>
       </w:r>
@@ -1103,7 +986,6 @@
         <w:rPr>
           <w:b w:val="0"/>
           <w:i w:val="0"/>
-          <w:strike w:val="0"/>
         </w:rPr>
         <w:t>She'd count again in the morning. She'd keep counting until it was four.</w:t>
       </w:r>
@@ -1113,7 +995,6 @@
         <w:rPr>
           <w:b w:val="0"/>
           <w:i w:val="0"/>
-          <w:strike w:val="0"/>
         </w:rPr>
         <w:t>Then the corridor took her, and the lights woke ahead of the stretcher, running on into the dark faster than anyone could walk.</w:t>
       </w:r>

</xml_diff>

<commit_message>
Ch2 deep-review edits (Book 1 closing lines restored); Ch3 medic made formal
Co-Authored-By: Claude Opus 5.5 <noreply@anthropic.com>
</commit_message>
<xml_diff>
--- a/claude-notes/manuscript-v2/02-now-the-throat-merged.docx
+++ b/claude-notes/manuscript-v2/02-now-the-throat-merged.docx
@@ -20,6 +20,7 @@
         <w:rPr>
           <w:b w:val="0"/>
           <w:i/>
+          <w:strike w:val="0"/>
           <w:color w:val="5C6B7D"/>
         </w:rPr>
         <w:t>“If I tell you to stop, you stop. Even if every part of you is screaming to charge. You stop.”</w:t>
@@ -30,6 +31,7 @@
         <w:rPr>
           <w:b w:val="0"/>
           <w:i/>
+          <w:strike w:val="0"/>
           <w:color w:val="5C6B7D"/>
         </w:rPr>
         <w:t>— Book 1, Chapter 22: The Engine and Eyes</w:t>
@@ -49,8 +51,9 @@
         <w:rPr>
           <w:b w:val="0"/>
           <w:i w:val="0"/>
+          <w:strike w:val="0"/>
         </w:rPr>
-        <w:t>Cold first. Metal floor, flat against her shoulder blade and the back of her skull. Then a second cold, smaller and wetter, on the place where her left arm stopped. Fresh sealant. It hadn't set yet; it still had the chill of the can in it. Thick at the front, thin at the back. Whoever had sprayed it had been shaking, and hadn't wanted to look.</w:t>
+        <w:t>Cold first. Metal floor, flat against her shoulder blade and the back of her skull. Then a second cold, smaller and wetter, on the place where her left arm stopped. Fresh sealant. It had skinned over, but it still had the chill of the can in it. Thick at the front, thin at the back. Whoever had sprayed it had been shaking, and hadn't wanted to look.</w:t>
       </w:r>
     </w:p>
     <w:p>
@@ -58,6 +61,7 @@
         <w:rPr>
           <w:b w:val="0"/>
           <w:i w:val="0"/>
+          <w:strike w:val="0"/>
         </w:rPr>
         <w:t>Ben, then. Gage didn't shake when he worked. Gage pressed too hard.</w:t>
       </w:r>
@@ -67,6 +71,7 @@
         <w:rPr>
           <w:b w:val="0"/>
           <w:i w:val="0"/>
+          <w:strike w:val="0"/>
         </w:rPr>
         <w:t>Her left hand closed. She felt the fingers curl, the thumb come across the knuckles, the small pull in the forearm. None of it was there. She'd explained this once to Gerald, back home, about the leg he didn't have anymore: the map stays drawn after the country's gone. She hadn't known what it felt like from the inside. She let the hand that didn't exist stay closed. She'd deal with it later.</w:t>
       </w:r>
@@ -76,6 +81,7 @@
         <w:rPr>
           <w:b w:val="0"/>
           <w:i w:val="0"/>
+          <w:strike w:val="0"/>
         </w:rPr>
         <w:t>Voices came before her eyes did.</w:t>
       </w:r>
@@ -85,6 +91,7 @@
         <w:rPr>
           <w:b w:val="0"/>
           <w:i w:val="0"/>
+          <w:strike w:val="0"/>
         </w:rPr>
         <w:t>"Why?" Her brother, cracked down the middle. "Otto is here and still gone. Camilla is half-dead. What did we ever do to you?"</w:t>
       </w:r>
@@ -94,6 +101,7 @@
         <w:rPr>
           <w:b w:val="0"/>
           <w:i/>
+          <w:strike w:val="0"/>
         </w:rPr>
         <w:t>Half-dead.</w:t>
       </w:r>
@@ -101,6 +109,7 @@
         <w:rPr>
           <w:b w:val="0"/>
           <w:i w:val="0"/>
+          <w:strike w:val="0"/>
         </w:rPr>
         <w:t xml:space="preserve"> So that was how she looked from up there.</w:t>
       </w:r>
@@ -110,8 +119,9 @@
         <w:rPr>
           <w:b w:val="0"/>
           <w:i w:val="0"/>
+          <w:strike w:val="0"/>
         </w:rPr>
-        <w:t>"Wrong question." Smooth, made, even. "Ask what was taken from your parents, and who signed for it."</w:t>
+        <w:t>"The question is not what I did to you." Smooth, made, even. "The question is: what will you do to regain the freedom that was once your birthright?"</w:t>
       </w:r>
     </w:p>
     <w:p>
@@ -119,6 +129,7 @@
         <w:rPr>
           <w:b w:val="0"/>
           <w:i w:val="0"/>
+          <w:strike w:val="0"/>
         </w:rPr>
         <w:t>"What does that mean?" Ben, from somewhere low and close.</w:t>
       </w:r>
@@ -128,24 +139,7 @@
         <w:rPr>
           <w:b w:val="0"/>
           <w:i w:val="0"/>
-        </w:rPr>
-        <w:t>"That somebody signed. Signatures leave records. You are ready now to read them."</w:t>
-      </w:r>
-    </w:p>
-    <w:p>
-      <w:r>
-        <w:rPr>
-          <w:b w:val="0"/>
-          <w:i w:val="0"/>
-        </w:rPr>
-        <w:t>Then someone was choking.</w:t>
-      </w:r>
-    </w:p>
-    <w:p>
-      <w:r>
-        <w:rPr>
-          <w:b w:val="0"/>
-          <w:i w:val="0"/>
+          <w:strike w:val="0"/>
         </w:rPr>
         <w:t>She opened her eyes.</w:t>
       </w:r>
@@ -155,8 +149,9 @@
         <w:rPr>
           <w:b w:val="0"/>
           <w:i w:val="0"/>
+          <w:strike w:val="0"/>
         </w:rPr>
-        <w:t>White light, everywhere, the kind that didn't flicker because nothing was burning to make it. She turned her head on the floor and took the room in a piece at a time.</w:t>
+        <w:t>White light, everywhere, the kind that didn't flicker because nothing was burning to make it. Flitzberg stood over them. His eyes went from Gage to her to Ben to Otto, and three of them looked back.</w:t>
       </w:r>
     </w:p>
     <w:p>
@@ -164,6 +159,27 @@
         <w:rPr>
           <w:b w:val="0"/>
           <w:i w:val="0"/>
+          <w:strike w:val="0"/>
+        </w:rPr>
+        <w:t>"You are ready now," he said. "Ready for the journey ahead."</w:t>
+      </w:r>
+    </w:p>
+    <w:p>
+      <w:r>
+        <w:rPr>
+          <w:b w:val="0"/>
+          <w:i w:val="0"/>
+          <w:strike w:val="0"/>
+        </w:rPr>
+        <w:t>Gage was on him before the last word was out. She turned her head on the floor and took the room in a piece at a time.</w:t>
+      </w:r>
+    </w:p>
+    <w:p>
+      <w:r>
+        <w:rPr>
+          <w:b w:val="0"/>
+          <w:i w:val="0"/>
+          <w:strike w:val="0"/>
         </w:rPr>
         <w:t>Gage, back to her, feet planted, all two hundred and twenty pounds of him set behind one arm, and at the end of the arm a hand, and in the hand Mr. Flitzberg's throat.</w:t>
       </w:r>
@@ -173,6 +189,7 @@
         <w:rPr>
           <w:b w:val="0"/>
           <w:i w:val="0"/>
+          <w:strike w:val="0"/>
         </w:rPr>
         <w:t>Flitzberg hadn't moved. Hands at his sides. His face was going a bad color, but his eyes were still doing what they always did, which was measure. He wasn't reaching for Gage's wrist.</w:t>
       </w:r>
@@ -182,6 +199,7 @@
         <w:rPr>
           <w:b w:val="0"/>
           <w:i w:val="0"/>
+          <w:strike w:val="0"/>
         </w:rPr>
         <w:t>Ben, on his knees two body-lengths away, the spray can still in his fist.</w:t>
       </w:r>
@@ -191,8 +209,9 @@
         <w:rPr>
           <w:b w:val="0"/>
           <w:i w:val="0"/>
+          <w:strike w:val="0"/>
         </w:rPr>
-        <w:t>Otto. Standing, square to the room, arms at his sides. Chest rising, chest falling. Eyes open, and nothing behind them. He was looking at the far wall, and only at the wall.</w:t>
+        <w:t>Otto. Standing, square to the room, arms at his sides. Chest rising, chest falling. Eyes open. They didn't follow anything. He was looking at the far wall, and only at the wall.</w:t>
       </w:r>
     </w:p>
     <w:p>
@@ -200,6 +219,7 @@
         <w:rPr>
           <w:b w:val="0"/>
           <w:i w:val="0"/>
+          <w:strike w:val="0"/>
         </w:rPr>
         <w:t>Behind him, the crystal. Three quarters green. The last quarter pulsing a slow, cold blue.</w:t>
       </w:r>
@@ -209,8 +229,9 @@
         <w:rPr>
           <w:b w:val="0"/>
           <w:i w:val="0"/>
+          <w:strike w:val="0"/>
         </w:rPr>
-        <w:t>She counted, because counting was what she did when nothing else would hold still. Gage. Ben. Otto. Her. Four of them. And Flitzberg.</w:t>
+        <w:t>She counted. Gage. Ben. Otto. Her. Four of them. And Flitzberg.</w:t>
       </w:r>
     </w:p>
     <w:p>
@@ -218,8 +239,9 @@
         <w:rPr>
           <w:b w:val="0"/>
           <w:i w:val="0"/>
+          <w:strike w:val="0"/>
         </w:rPr>
-        <w:t>She checked his jaw. The first time they'd met, he'd been wearing her dead grandfather's face, and a seam of light at the hinge had given him away. No seam now. Pale, smooth, full-cheeked, darkening under Gage's hand. His own face, she thought. Probably.</w:t>
+        <w:t>She checked his jaw. The first time they'd met, he'd been wearing her dead grandfather Pappy's face, and a seam of light at the hinge had given him away. No seam now. Pale, smooth, full-cheeked, darkening under Gage's hand. His own face, she thought. Probably.</w:t>
       </w:r>
     </w:p>
     <w:p>
@@ -227,6 +249,7 @@
         <w:rPr>
           <w:b w:val="0"/>
           <w:i w:val="0"/>
+          <w:strike w:val="0"/>
         </w:rPr>
         <w:t>There were no guards in the room. Nobody behind the glass was moving. The man who ran this place had walked in alone and let the strongest boy in Sector One get a hand on his windpipe. Either he'd lost his mind, or he wanted to be within reach.</w:t>
       </w:r>
@@ -236,6 +259,7 @@
         <w:rPr>
           <w:b w:val="0"/>
           <w:i w:val="0"/>
+          <w:strike w:val="0"/>
         </w:rPr>
         <w:t>She didn't think he'd lost his mind.</w:t>
       </w:r>
@@ -245,6 +269,7 @@
         <w:rPr>
           <w:b w:val="0"/>
           <w:i w:val="0"/>
+          <w:strike w:val="0"/>
         </w:rPr>
         <w:t>Gage's grip was trembling. It hadn't tightened. The long muscles in his forearm were jumping.</w:t>
       </w:r>
@@ -254,8 +279,9 @@
         <w:rPr>
           <w:b w:val="0"/>
           <w:i w:val="0"/>
+          <w:strike w:val="0"/>
         </w:rPr>
-        <w:t>"You are angry at the right person," Flitzberg got out. He had to stop and swallow, and she watched it go down him. "The right person is also the only one who will answer you. That is why I came in alone."</w:t>
+        <w:t>"You are angry at the right person," Flitzberg got out. He had to stop and swallow, and she watched it go down him. "The right person is also the only one who will answer you."</w:t>
       </w:r>
     </w:p>
     <w:p>
@@ -263,6 +289,7 @@
         <w:rPr>
           <w:b w:val="0"/>
           <w:i w:val="0"/>
+          <w:strike w:val="0"/>
         </w:rPr>
         <w:t>Gage's arm shook harder.</w:t>
       </w:r>
@@ -272,6 +299,7 @@
         <w:rPr>
           <w:b w:val="0"/>
           <w:i w:val="0"/>
+          <w:strike w:val="0"/>
         </w:rPr>
         <w:t>She tried to say his name, and nothing came up behind it. She wet her lips. Tried again.</w:t>
       </w:r>
@@ -281,6 +309,7 @@
         <w:rPr>
           <w:b w:val="0"/>
           <w:i w:val="0"/>
+          <w:strike w:val="0"/>
         </w:rPr>
         <w:t>"Gage."</w:t>
       </w:r>
@@ -290,6 +319,7 @@
         <w:rPr>
           <w:b w:val="0"/>
           <w:i w:val="0"/>
+          <w:strike w:val="0"/>
         </w:rPr>
         <w:t>His head turned a quarter inch.</w:t>
       </w:r>
@@ -299,6 +329,7 @@
         <w:rPr>
           <w:b w:val="0"/>
           <w:i w:val="0"/>
+          <w:strike w:val="0"/>
         </w:rPr>
         <w:t>"Stop."</w:t>
       </w:r>
@@ -308,6 +339,7 @@
         <w:rPr>
           <w:b w:val="0"/>
           <w:i w:val="0"/>
+          <w:strike w:val="0"/>
         </w:rPr>
         <w:t>He'd promised her that, outside the four doors. He'd kept it once already, with the shock still in his bones. His hand opened, one finger at a time, as if each one had to be argued with separately. He stepped back. Not far.</w:t>
       </w:r>
@@ -317,6 +349,7 @@
         <w:rPr>
           <w:b w:val="0"/>
           <w:i w:val="0"/>
+          <w:strike w:val="0"/>
         </w:rPr>
         <w:t>Flitzberg didn't rub his throat. He left the marks where they could see them.</w:t>
       </w:r>
@@ -326,6 +359,7 @@
         <w:rPr>
           <w:b w:val="0"/>
           <w:i w:val="0"/>
+          <w:strike w:val="0"/>
         </w:rPr>
         <w:t>"Then answer," Gage said. "Why? What did we ever do to you?"</w:t>
       </w:r>
@@ -335,8 +369,9 @@
         <w:rPr>
           <w:b w:val="0"/>
           <w:i w:val="0"/>
+          <w:strike w:val="0"/>
         </w:rPr>
-        <w:t>"Nothing." Flitzberg's voice came out scraped. "You were not —" He stopped, and swallowed, and it cost him. "You were not punished. You were chosen. I know those look the same from where you stand." He swallowed again, and waited for his voice. "At your Initiation the city could not decide whose you were. Three names, no house. No one answerable for whether you came back up. I watched it fail to decide, and I decided." His eyes went to Camilla on the floor. "Your sister needs more than a spray can. Then you can hate me properly."</w:t>
+        <w:t>"Nothing." Flitzberg's voice came out scraped. "You were —" He stopped, and swallowed, and it cost him. "You were chosen. I know that looks like punishment from where you stand." He swallowed again, and waited for his voice. "At your Initiation the city could not decide whose you were. Three names, and no house answerable for whether you came back up. I watched the city fail to decide, and I decided you were ours. What was taken from your parents was signed for. Signatures leave records. You are ready now to read them." His eyes went to Camilla on the floor. "Your sister needs more than a spray can. Then you can hate me properly."</w:t>
       </w:r>
     </w:p>
     <w:p>
@@ -344,6 +379,7 @@
         <w:rPr>
           <w:b w:val="0"/>
           <w:i w:val="0"/>
+          <w:strike w:val="0"/>
         </w:rPr>
         <w:t>He raised one hand where they could all see it and beckoned at the glass. "If a stranger had reached her before I did, you would have broken him. So they waited, and I came first."</w:t>
       </w:r>
@@ -353,6 +389,7 @@
         <w:rPr>
           <w:b w:val="0"/>
           <w:i/>
+          <w:strike w:val="0"/>
         </w:rPr>
         <w:t>Waited.</w:t>
       </w:r>
@@ -360,8 +397,9 @@
         <w:rPr>
           <w:b w:val="0"/>
           <w:i w:val="0"/>
+          <w:strike w:val="0"/>
         </w:rPr>
-        <w:t xml:space="preserve"> While she lay on the metal with Ben's sealant still wet on her stump. Camilla added it to the count.</w:t>
+        <w:t xml:space="preserve"> While she lay on the metal with Ben's sealant still wet on her stump.</w:t>
       </w:r>
     </w:p>
     <w:p>
@@ -369,6 +407,7 @@
         <w:rPr>
           <w:b w:val="0"/>
           <w:i w:val="0"/>
+          <w:strike w:val="0"/>
         </w:rPr>
         <w:t>Three people came in fast, two with a wheeled stretcher, one with cases, sleeves pushed up. Ben was between them and Camilla before the door finished opening, the can held up like a weapon.</w:t>
       </w:r>
@@ -378,6 +417,7 @@
         <w:rPr>
           <w:b w:val="0"/>
           <w:i w:val="0"/>
+          <w:strike w:val="0"/>
         </w:rPr>
         <w:t>The oldest of them, a woman with grey at her temples and hands scrubbed pink, stopped dead. She set her case on the floor, opened it and turned it so Ben could see inside.</w:t>
       </w:r>
@@ -387,8 +427,9 @@
         <w:rPr>
           <w:b w:val="0"/>
           <w:i w:val="0"/>
+          <w:strike w:val="0"/>
         </w:rPr>
-        <w:t>"Clean sealant. Blood. Pain control that won't fog her." She didn't move toward Camilla. "You can walk next to the stretcher with your hand on her the whole way. Nobody's going to make you let go."</w:t>
+        <w:t>"Clean sealant. Blood. Pain control that will not fog her." She didn't move toward Camilla. "You can walk next to the stretcher with your hand on her the whole way. Nobody is going to make you let go."</w:t>
       </w:r>
     </w:p>
     <w:p>
@@ -396,6 +437,7 @@
         <w:rPr>
           <w:b w:val="0"/>
           <w:i w:val="0"/>
+          <w:strike w:val="0"/>
         </w:rPr>
         <w:t>Ben looked at Gage. Gage looked at the case. Camilla looked too: sealed instruments in fitted foam, every one of them bright. Nothing she'd ever owned had been bright.</w:t>
       </w:r>
@@ -405,6 +447,7 @@
         <w:rPr>
           <w:b w:val="0"/>
           <w:i w:val="0"/>
+          <w:strike w:val="0"/>
         </w:rPr>
         <w:t>Gage nodded.</w:t>
       </w:r>
@@ -414,6 +457,7 @@
         <w:rPr>
           <w:b w:val="0"/>
           <w:i w:val="0"/>
+          <w:strike w:val="0"/>
         </w:rPr>
         <w:t>The two with the stretcher bent to her.</w:t>
       </w:r>
@@ -423,6 +467,7 @@
         <w:rPr>
           <w:b w:val="0"/>
           <w:i w:val="0"/>
+          <w:strike w:val="0"/>
         </w:rPr>
         <w:t>"No," Camilla said. "Him first." She couldn't lift the arm she wanted to lift, so she lifted the other one, two inches off the floor, and let it fall toward Otto. "Him. Then me."</w:t>
       </w:r>
@@ -432,6 +477,7 @@
         <w:rPr>
           <w:b w:val="0"/>
           <w:i w:val="0"/>
+          <w:strike w:val="0"/>
         </w:rPr>
         <w:t>The medic looked at the boy standing in the middle of the room breathing like a sleeper. She said one word to the third medic, who took a light and a grey instrument to Otto.</w:t>
       </w:r>
@@ -441,6 +487,7 @@
         <w:rPr>
           <w:b w:val="0"/>
           <w:i w:val="0"/>
+          <w:strike w:val="0"/>
         </w:rPr>
         <w:t>"Then we do you here," she told Camilla, and knelt. "Hold still."</w:t>
       </w:r>
@@ -450,6 +497,7 @@
         <w:rPr>
           <w:b w:val="0"/>
           <w:i w:val="0"/>
+          <w:strike w:val="0"/>
         </w:rPr>
         <w:t>"I've had practice."</w:t>
       </w:r>
@@ -459,8 +507,9 @@
         <w:rPr>
           <w:b w:val="0"/>
           <w:i w:val="0"/>
+          <w:strike w:val="0"/>
         </w:rPr>
-        <w:t>The new sealant went on over Ben's, colder and deeper, and under it came the first warmth her shoulder had given her since the drone. A line went into the back of her right hand. The clear bag above her started to empty. For a while nothing changed, and then everything did: the room's edges came back sharp.</w:t>
+        <w:t>The new sealant went on over Ben's, colder and deeper, and under it came the first warmth her shoulder had given her since the drone. A line went into the back of her right hand. The clear bag above her started to empty. Then the room's edges came back sharp.</w:t>
       </w:r>
     </w:p>
     <w:p>
@@ -468,6 +517,7 @@
         <w:rPr>
           <w:b w:val="0"/>
           <w:i w:val="0"/>
+          <w:strike w:val="0"/>
         </w:rPr>
         <w:t>Across the room, the third medic shone the light in Otto's eyes. Left, right. His pupils did what pupils do. His face did nothing. The instrument went to his neck, his wrist, his chest. The medic looked at Flitzberg and didn't need to say anything.</w:t>
       </w:r>
@@ -477,6 +527,7 @@
         <w:rPr>
           <w:b w:val="0"/>
           <w:i w:val="0"/>
+          <w:strike w:val="0"/>
         </w:rPr>
         <w:t>"What's wrong with him?" Ben's voice cracked. "He's right there. He's breathing. Why won't he come back?"</w:t>
       </w:r>
@@ -486,6 +537,7 @@
         <w:rPr>
           <w:b w:val="0"/>
           <w:i w:val="0"/>
+          <w:strike w:val="0"/>
         </w:rPr>
         <w:t>Flitzberg looked past him at Otto, the boy who'd held ten stones open over a lake of fire so the rest of them could drop through, and had stayed behind to do it.</w:t>
       </w:r>
@@ -495,6 +547,7 @@
         <w:rPr>
           <w:b w:val="0"/>
           <w:i w:val="0"/>
+          <w:strike w:val="0"/>
         </w:rPr>
         <w:t>"I do not know."</w:t>
       </w:r>
@@ -504,6 +557,7 @@
         <w:rPr>
           <w:b w:val="0"/>
           <w:i w:val="0"/>
+          <w:strike w:val="0"/>
         </w:rPr>
         <w:t>"You did this."</w:t>
       </w:r>
@@ -513,6 +567,7 @@
         <w:rPr>
           <w:b w:val="0"/>
           <w:i w:val="0"/>
+          <w:strike w:val="0"/>
         </w:rPr>
         <w:t>"Yes. And I do not know." He let that sit. "Our instruments say he is well. Heart, breath, all of it. The instruments are wrong. Some part of him spent itself in that room, and it has not come back. We will keep his body strong and his door open. I will not pretend to more than that."</w:t>
       </w:r>
@@ -522,6 +577,7 @@
         <w:rPr>
           <w:b w:val="0"/>
           <w:i w:val="0"/>
+          <w:strike w:val="0"/>
         </w:rPr>
         <w:t>"That's not good enough," Gage said.</w:t>
       </w:r>
@@ -531,6 +587,7 @@
         <w:rPr>
           <w:b w:val="0"/>
           <w:i w:val="0"/>
+          <w:strike w:val="0"/>
         </w:rPr>
         <w:t>"It is what there is."</w:t>
       </w:r>
@@ -540,6 +597,7 @@
         <w:rPr>
           <w:b w:val="0"/>
           <w:i w:val="0"/>
+          <w:strike w:val="0"/>
         </w:rPr>
         <w:t>Gage took a step toward him. Flitzberg didn't take one back.</w:t>
       </w:r>
@@ -549,8 +607,9 @@
         <w:rPr>
           <w:b w:val="0"/>
           <w:i w:val="0"/>
+          <w:strike w:val="0"/>
         </w:rPr>
-        <w:t>"The guard at the doors," Gage said. "'Pass all four, you live. Fail—' He didn't finish. You finish it."</w:t>
+        <w:t>"The guard at the doors," Gage said. "'You pass all four, you live. You fail—' He didn't finish. You finish it."</w:t>
       </w:r>
     </w:p>
     <w:p>
@@ -558,8 +617,9 @@
         <w:rPr>
           <w:b w:val="0"/>
           <w:i w:val="0"/>
+          <w:strike w:val="0"/>
         </w:rPr>
-        <w:t>"Some who fail die." Flitzberg didn't soften it. "Not by our hand. But the rooms are not theater. That drone was not pretending. When a team breaks in there, the rooms do not get gentler."</w:t>
+        <w:t>"Some who fail die." Flitzberg didn't soften it. "The rooms are not theater. That drone was not pretending, and it was ours. When a team breaks in there, the rooms do not get gentler."</w:t>
       </w:r>
     </w:p>
     <w:p>
@@ -567,8 +627,9 @@
         <w:rPr>
           <w:b w:val="0"/>
           <w:i w:val="0"/>
+          <w:strike w:val="0"/>
         </w:rPr>
-        <w:t>"And Camilla's arm?" Ben was crying now and not hiding it. "And Otto? That was the price?"</w:t>
+        <w:t>"That was the price?" Ben was crying now and not hiding it. "Her arm. Him."</w:t>
       </w:r>
     </w:p>
     <w:p>
@@ -576,6 +637,7 @@
         <w:rPr>
           <w:b w:val="0"/>
           <w:i w:val="0"/>
+          <w:strike w:val="0"/>
         </w:rPr>
         <w:t>"Yes."</w:t>
       </w:r>
@@ -585,6 +647,7 @@
         <w:rPr>
           <w:b w:val="0"/>
           <w:i w:val="0"/>
+          <w:strike w:val="0"/>
         </w:rPr>
         <w:t>The medic's hands kept working. The bag kept emptying.</w:t>
       </w:r>
@@ -594,6 +657,7 @@
         <w:rPr>
           <w:b w:val="0"/>
           <w:i w:val="0"/>
+          <w:strike w:val="0"/>
         </w:rPr>
         <w:t>"She paid it on her feet," Flitzberg said to Gage. "Remember that, before anything else about tonight."</w:t>
       </w:r>
@@ -603,6 +667,7 @@
         <w:rPr>
           <w:b w:val="0"/>
           <w:i w:val="0"/>
+          <w:strike w:val="0"/>
         </w:rPr>
         <w:t>"Don't," Camilla said.</w:t>
       </w:r>
@@ -612,6 +677,7 @@
         <w:rPr>
           <w:b w:val="0"/>
           <w:i w:val="0"/>
+          <w:strike w:val="0"/>
         </w:rPr>
         <w:t>He looked down at her.</w:t>
       </w:r>
@@ -621,6 +687,7 @@
         <w:rPr>
           <w:b w:val="0"/>
           <w:i w:val="0"/>
+          <w:strike w:val="0"/>
         </w:rPr>
         <w:t>"Don't make it a story." Her voice shook and she let it. "I didn't stand up to anything. I counted. Somebody had to count."</w:t>
       </w:r>
@@ -630,6 +697,7 @@
         <w:rPr>
           <w:b w:val="0"/>
           <w:i w:val="0"/>
+          <w:strike w:val="0"/>
         </w:rPr>
         <w:t>"And somebody had to pay," Flitzberg said. "Both of those are true. I will not take either one back to make this easier for you."</w:t>
       </w:r>
@@ -639,6 +707,7 @@
         <w:rPr>
           <w:b w:val="0"/>
           <w:i w:val="0"/>
+          <w:strike w:val="0"/>
         </w:rPr>
         <w:t>She didn't know what to do with her face.</w:t>
       </w:r>
@@ -648,6 +717,7 @@
         <w:rPr>
           <w:b w:val="0"/>
           <w:i w:val="0"/>
+          <w:strike w:val="0"/>
         </w:rPr>
         <w:t>Gage turned to the door they'd come in by. "We're going home."</w:t>
       </w:r>
@@ -657,6 +727,7 @@
         <w:rPr>
           <w:b w:val="0"/>
           <w:i w:val="0"/>
+          <w:strike w:val="0"/>
         </w:rPr>
         <w:t>"Not tonight."</w:t>
       </w:r>
@@ -666,6 +737,7 @@
         <w:rPr>
           <w:b w:val="0"/>
           <w:i w:val="0"/>
+          <w:strike w:val="0"/>
         </w:rPr>
         <w:t>"You don't get to say—"</w:t>
       </w:r>
@@ -675,13 +747,15 @@
         <w:rPr>
           <w:b w:val="0"/>
           <w:i w:val="0"/>
+          <w:strike w:val="0"/>
         </w:rPr>
-        <w:t xml:space="preserve">"In four days," Flitzberg said, and his voice gave out on him again, and he made it work, "the mine writes one word next to your three names on the shift roll. </w:t>
+        <w:t xml:space="preserve">"Four days after a missed shift," Flitzberg said, and his voice gave out on him again, and he made it work, "the mine writes one word next to your three names on the shift roll. </w:t>
       </w:r>
       <w:r>
         <w:rPr>
           <w:b w:val="0"/>
           <w:i/>
+          <w:strike w:val="0"/>
         </w:rPr>
         <w:t>Absconded.</w:t>
       </w:r>
@@ -689,8 +763,9 @@
         <w:rPr>
           <w:b w:val="0"/>
           <w:i w:val="0"/>
+          <w:strike w:val="0"/>
         </w:rPr>
-        <w:t xml:space="preserve"> It is the kindest word it has. Nobody bills a street for a boy who ran. Your slots go back in the pool, Camilla's ration card is not drawn again, and nobody asks why. Miner Town does not go looking for children who walk away." He swallowed. "Before then, you choose. Stay, or go home with a story I give you, one that holds. Walk back through those gates tonight, bleeding, with no story, and you are the trouble the city bills your street for. Rations short. Quotas up. Somebody's door kicked in who had nothing to do with you."</w:t>
+        <w:t xml:space="preserve"> It is the kindest word it has. Camilla's ration card is not drawn again, and nobody asks why." He swallowed. "Before that, you choose. Stay, or go home with a story I give you, one that holds."</w:t>
       </w:r>
     </w:p>
     <w:p>
@@ -698,8 +773,9 @@
         <w:rPr>
           <w:b w:val="0"/>
           <w:i w:val="0"/>
+          <w:strike w:val="0"/>
         </w:rPr>
-        <w:t>Ben's head came up. "Gretchen's at the gates. She'll be there tomorrow. She'll be there every day."</w:t>
+        <w:t>"And if we walk out tonight?" Gage said.</w:t>
       </w:r>
     </w:p>
     <w:p>
@@ -707,6 +783,27 @@
         <w:rPr>
           <w:b w:val="0"/>
           <w:i w:val="0"/>
+          <w:strike w:val="0"/>
+        </w:rPr>
+        <w:t>"Bleeding, with no story? Then you are the trouble the city bills your street for. Rations short. Quotas up. A door kicked in that had nothing to do with you."</w:t>
+      </w:r>
+    </w:p>
+    <w:p>
+      <w:r>
+        <w:rPr>
+          <w:b w:val="0"/>
+          <w:i w:val="0"/>
+          <w:strike w:val="0"/>
+        </w:rPr>
+        <w:t>Ben's head came up. "Gretchen'll be at the gates. She'll be there tomorrow. She'll be there every day."</w:t>
+      </w:r>
+    </w:p>
+    <w:p>
+      <w:r>
+        <w:rPr>
+          <w:b w:val="0"/>
+          <w:i w:val="0"/>
+          <w:strike w:val="0"/>
         </w:rPr>
         <w:t>"I know."</w:t>
       </w:r>
@@ -716,6 +813,7 @@
         <w:rPr>
           <w:b w:val="0"/>
           <w:i w:val="0"/>
+          <w:strike w:val="0"/>
         </w:rPr>
         <w:t>"Then tell her."</w:t>
       </w:r>
@@ -725,6 +823,7 @@
         <w:rPr>
           <w:b w:val="0"/>
           <w:i w:val="0"/>
+          <w:strike w:val="0"/>
         </w:rPr>
         <w:t>"I cannot send word up. Nothing goes up that the ground could read." Flitzberg looked away from them, at the glass. He hadn't done that yet. "I am sorry. That is not a thing I can fix tonight."</w:t>
       </w:r>
@@ -734,6 +833,7 @@
         <w:rPr>
           <w:b w:val="0"/>
           <w:i w:val="0"/>
+          <w:strike w:val="0"/>
         </w:rPr>
         <w:t>Ben laughed, once, wet and ugly. "So she stands there four days, and then they write it down, and she stands there anyway." He wiped his face with his wrist. "She'll think I ran."</w:t>
       </w:r>
@@ -743,6 +843,7 @@
         <w:rPr>
           <w:b w:val="0"/>
           <w:i w:val="0"/>
+          <w:strike w:val="0"/>
         </w:rPr>
         <w:t>"She will," Flitzberg said. "Until you tell her otherwise."</w:t>
       </w:r>
@@ -752,6 +853,7 @@
         <w:rPr>
           <w:b w:val="0"/>
           <w:i w:val="0"/>
+          <w:strike w:val="0"/>
         </w:rPr>
         <w:t>Gage's hands had closed. Camilla watched them close.</w:t>
       </w:r>
@@ -761,6 +863,7 @@
         <w:rPr>
           <w:b w:val="0"/>
           <w:i w:val="0"/>
+          <w:strike w:val="0"/>
         </w:rPr>
         <w:t>Then he turned his back on Flitzberg and came to her, and went down on one knee beside the medic, and got an arm under her shoulders. His other hand went under her knees. He was careful of the sealant. He didn't see the line in the back of her hand.</w:t>
       </w:r>
@@ -770,8 +873,9 @@
         <w:rPr>
           <w:b w:val="0"/>
           <w:i w:val="0"/>
+          <w:strike w:val="0"/>
         </w:rPr>
-        <w:t>"Hey." The medic's hand came down flat on his forearm. "She's got a line in. You lift her now and that shoulder opens before you're out of this room."</w:t>
+        <w:t>"Hey." The medic's hand came down flat on his forearm. "She has a line in and a seal that has not cured. You haul her up like that and the shoulder opens before you are out of this room."</w:t>
       </w:r>
     </w:p>
     <w:p>
@@ -779,6 +883,7 @@
         <w:rPr>
           <w:b w:val="0"/>
           <w:i w:val="0"/>
+          <w:strike w:val="0"/>
         </w:rPr>
         <w:t>"Then pull it."</w:t>
       </w:r>
@@ -788,8 +893,9 @@
         <w:rPr>
           <w:b w:val="0"/>
           <w:i w:val="0"/>
+          <w:strike w:val="0"/>
         </w:rPr>
-        <w:t>"I'm not pulling it."</w:t>
+        <w:t>"I am not pulling it."</w:t>
       </w:r>
     </w:p>
     <w:p>
@@ -797,6 +903,7 @@
         <w:rPr>
           <w:b w:val="0"/>
           <w:i w:val="0"/>
+          <w:strike w:val="0"/>
         </w:rPr>
         <w:t>"Ben." Gage didn't look up. "Get Otto."</w:t>
       </w:r>
@@ -806,6 +913,7 @@
         <w:rPr>
           <w:b w:val="0"/>
           <w:i w:val="0"/>
+          <w:strike w:val="0"/>
         </w:rPr>
         <w:t>Ben tried to stand. He got one foot under himself and swayed, and put a hand down on the floor to stop it, and stayed there.</w:t>
       </w:r>
@@ -815,6 +923,7 @@
         <w:rPr>
           <w:b w:val="0"/>
           <w:i w:val="0"/>
+          <w:strike w:val="0"/>
         </w:rPr>
         <w:t>"Gage." Camilla's head was against his chest. She could feel him breathing, too fast, end-of-shift fast. "Look at Ben. He can't get up. Who's carrying Otto?"</w:t>
       </w:r>
@@ -824,6 +933,7 @@
         <w:rPr>
           <w:b w:val="0"/>
           <w:i w:val="0"/>
+          <w:strike w:val="0"/>
         </w:rPr>
         <w:t>"I'll come back for him."</w:t>
       </w:r>
@@ -833,6 +943,17 @@
         <w:rPr>
           <w:b w:val="0"/>
           <w:i w:val="0"/>
+          <w:strike w:val="0"/>
+        </w:rPr>
+        <w:t>Whatever was in the bag was holding the edges of her words together. She had to say it before it let go.</w:t>
+      </w:r>
+    </w:p>
+    <w:p>
+      <w:r>
+        <w:rPr>
+          <w:b w:val="0"/>
+          <w:i w:val="0"/>
+          <w:strike w:val="0"/>
         </w:rPr>
         <w:t>"All the way up, and through the gates, and back down. With me on you, and him at the top with nobody." She made herself say the rest. "Gage. I counted him. I've been counting all of you since I opened my eyes, and every time I get to him I get nothing back. He's breathing and he isn't there, and I've been lying here not saying it. He can't eat. He can't drink unless somebody makes him. If we carry him home, Ma can't do that for long. I can't. He stays where the machines are, or he dies in a shack with his eyes open, and I'll be the one who counted that."</w:t>
       </w:r>
@@ -842,6 +963,7 @@
         <w:rPr>
           <w:b w:val="0"/>
           <w:i w:val="0"/>
+          <w:strike w:val="0"/>
         </w:rPr>
         <w:t>Gage had stopped moving. She felt the stop go through him.</w:t>
       </w:r>
@@ -851,6 +973,7 @@
         <w:rPr>
           <w:b w:val="0"/>
           <w:i w:val="0"/>
+          <w:strike w:val="0"/>
         </w:rPr>
         <w:t>"You can carry me," she said. "You're already doing it. You can't carry him home."</w:t>
       </w:r>
@@ -860,6 +983,7 @@
         <w:rPr>
           <w:b w:val="0"/>
           <w:i w:val="0"/>
+          <w:strike w:val="0"/>
         </w:rPr>
         <w:t>Ben made a sound on the floor. Flitzberg stood where he was and said nothing, and his hands stayed at his sides.</w:t>
       </w:r>
@@ -869,6 +993,7 @@
         <w:rPr>
           <w:b w:val="0"/>
           <w:i w:val="0"/>
+          <w:strike w:val="0"/>
         </w:rPr>
         <w:t>"We stay," she said. "Tonight. He talks tomorrow, all of it. And if he doesn't, I stop telling Gage to stop."</w:t>
       </w:r>
@@ -878,6 +1003,7 @@
         <w:rPr>
           <w:b w:val="0"/>
           <w:i w:val="0"/>
+          <w:strike w:val="0"/>
         </w:rPr>
         <w:t>Gage looked at her for a long time. Then he laid her back down on the floor, and his hands came open, slowly, and he stayed on his knee beside her.</w:t>
       </w:r>
@@ -887,6 +1013,7 @@
         <w:rPr>
           <w:b w:val="0"/>
           <w:i w:val="0"/>
+          <w:strike w:val="0"/>
         </w:rPr>
         <w:t>"Tomorrow," he said to Flitzberg. "All of it."</w:t>
       </w:r>
@@ -896,6 +1023,7 @@
         <w:rPr>
           <w:b w:val="0"/>
           <w:i w:val="0"/>
+          <w:strike w:val="0"/>
         </w:rPr>
         <w:t>"All of it," Flitzberg said. "Then you choose. You have my word."</w:t>
       </w:r>
@@ -905,8 +1033,9 @@
         <w:rPr>
           <w:b w:val="0"/>
           <w:i w:val="0"/>
+          <w:strike w:val="0"/>
         </w:rPr>
-        <w:t>The medic let out her breath, and checked the line, and taped it flat against Camilla's hand. "That stays in. You'll be stronger by morning, and you'll hate the tape. Both are fine." She nodded to the others. "Now."</w:t>
+        <w:t>The medic let out her breath, and checked the line, and taped it flat against Camilla's hand. "That stays in. You will be stronger by morning, and you will hate the tape. Both are fine." She nodded to the others. "Now."</w:t>
       </w:r>
     </w:p>
     <w:p>
@@ -914,8 +1043,9 @@
         <w:rPr>
           <w:b w:val="0"/>
           <w:i w:val="0"/>
+          <w:strike w:val="0"/>
         </w:rPr>
-        <w:t>They lifted her: four hands under her, nothing jarred, nothing left to find its own way. She'd never been lifted. In Miner Town you got dragged. Ben came with her, his hand on her good shoulder, exactly as he'd been told he could.</w:t>
+        <w:t>They lifted her: four hands under her, nothing jarred, nothing left to find its own way. She'd never been lifted like this. In Miner Town you got dragged. Ben came with her, his hand on her good shoulder, exactly as he'd been told he could.</w:t>
       </w:r>
     </w:p>
     <w:p>
@@ -923,6 +1053,7 @@
         <w:rPr>
           <w:b w:val="0"/>
           <w:i w:val="0"/>
+          <w:strike w:val="0"/>
         </w:rPr>
         <w:t>Flitzberg went to the inner doors. They opened on a corridor, and the lights woke one at a time ahead of them, each a step beyond the last.</w:t>
       </w:r>
@@ -932,6 +1063,7 @@
         <w:rPr>
           <w:b w:val="0"/>
           <w:i w:val="0"/>
+          <w:strike w:val="0"/>
         </w:rPr>
         <w:t>"Eat," he said. "Sleep. Sit with your friend and talk to him. For all our instruments can tell, he hears every word."</w:t>
       </w:r>
@@ -941,6 +1073,7 @@
         <w:rPr>
           <w:b w:val="0"/>
           <w:i w:val="0"/>
+          <w:strike w:val="0"/>
         </w:rPr>
         <w:t>From the stretcher, flat on her back, Camilla got the room one last time.</w:t>
       </w:r>
@@ -950,8 +1083,9 @@
         <w:rPr>
           <w:b w:val="0"/>
           <w:i w:val="0"/>
+          <w:strike w:val="0"/>
         </w:rPr>
-        <w:t>Gage went to Otto. He said Otto's name once and got nothing back. Then he bent, took Otto's arm across his shoulders, and lifted him. She'd seen this before: months ago, at the end of the Initiation, outside the mine gates on the fourth morning, Gage walking up out of the dark with Otto across his shoulders and Ben by the collar, while the guards waited for the broken boy they'd been told to expect.</w:t>
+        <w:t>Gage went to Otto. He said Otto's name once and got nothing back. Then he bent, took Otto's arm across his shoulders, and lifted him. She'd seen this before, at the end of the Initiation, outside the mine gates on the fourth morning, Gage walking up out of the dark with Otto across his shoulders and Ben by the collar, while the guards waited for the broken marionette they expected.</w:t>
       </w:r>
     </w:p>
     <w:p>
@@ -959,6 +1093,7 @@
         <w:rPr>
           <w:b w:val="0"/>
           <w:i w:val="0"/>
+          <w:strike w:val="0"/>
         </w:rPr>
         <w:t>He was carrying Otto out again. This time Otto didn't know it.</w:t>
       </w:r>
@@ -968,6 +1103,7 @@
         <w:rPr>
           <w:b w:val="0"/>
           <w:i w:val="0"/>
+          <w:strike w:val="0"/>
         </w:rPr>
         <w:t>Behind the empty place where Otto had stood, the crystal. Still a quarter blue.</w:t>
       </w:r>
@@ -977,6 +1113,17 @@
         <w:rPr>
           <w:b w:val="0"/>
           <w:i w:val="0"/>
+          <w:strike w:val="0"/>
+        </w:rPr>
+        <w:t>Then the corridor took her, and the lights woke ahead of the stretcher, running on into the dark faster than anyone could walk.</w:t>
+      </w:r>
+    </w:p>
+    <w:p>
+      <w:r>
+        <w:rPr>
+          <w:b w:val="0"/>
+          <w:i w:val="0"/>
+          <w:strike w:val="0"/>
         </w:rPr>
         <w:t>Four of them. Three awake.</w:t>
       </w:r>
@@ -986,17 +1133,9 @@
         <w:rPr>
           <w:b w:val="0"/>
           <w:i w:val="0"/>
+          <w:strike w:val="0"/>
         </w:rPr>
         <w:t>She'd count again in the morning. She'd keep counting until it was four.</w:t>
-      </w:r>
-    </w:p>
-    <w:p>
-      <w:r>
-        <w:rPr>
-          <w:b w:val="0"/>
-          <w:i w:val="0"/>
-        </w:rPr>
-        <w:t>Then the corridor took her, and the lights woke ahead of the stretcher, running on into the dark faster than anyone could walk.</w:t>
       </w:r>
     </w:p>
     <w:sectPr>

</xml_diff>

<commit_message>
Ch2: Gage grabs Flitzberg before 'Why?', as in Book 1
Co-Authored-By: Claude Opus 5.5 <noreply@anthropic.com>
</commit_message>
<xml_diff>
--- a/claude-notes/manuscript-v2/02-now-the-throat-merged.docx
+++ b/claude-notes/manuscript-v2/02-now-the-throat-merged.docx
@@ -151,7 +151,7 @@
           <w:i w:val="0"/>
           <w:strike w:val="0"/>
         </w:rPr>
-        <w:t>White light, everywhere, the kind that didn't flicker because nothing was burning to make it. Flitzberg stood over them. His eyes went from Gage to her to Ben to Otto, and three of them looked back.</w:t>
+        <w:t>White light, everywhere, the kind that didn't flicker because nothing was burning to make it. Flitzberg stood with Gage's hand at his throat. His eyes went from Gage to her to Ben to Otto, and three of them looked back.</w:t>
       </w:r>
     </w:p>
     <w:p>
@@ -171,7 +171,7 @@
           <w:i w:val="0"/>
           <w:strike w:val="0"/>
         </w:rPr>
-        <w:t>Gage was on him before the last word was out. She turned her head on the floor and took the room in a piece at a time.</w:t>
+        <w:t>Gage's arm locked before the last word was out. She turned her head on the floor and took the room in a piece at a time.</w:t>
       </w:r>
     </w:p>
     <w:p>

</xml_diff>